<commit_message>
Diseño de interfaces Proyecto 4
</commit_message>
<xml_diff>
--- a/Acceso a datos/Actividades/Ejercicios/Ejercicios.docx
+++ b/Acceso a datos/Actividades/Ejercicios/Ejercicios.docx
@@ -34,8 +34,8 @@
       </w:r>
       <w:r>
         <w:rPr>
-          <w:sz w:val="56"/>
-          <w:szCs w:val="56"/>
+          <w:sz w:val="72"/>
+          <w:szCs w:val="72"/>
         </w:rPr>
       </w:r>
       <w:r>
@@ -176,6 +176,7 @@
           <w:bCs/>
           <w:sz w:val="44"/>
           <w:szCs w:val="44"/>
+          <w:highlight w:val="none"/>
         </w:rPr>
       </w:r>
       <w:r>
@@ -333,7 +334,7 @@
           </w:hyperlink>
           <w:r>
             <w:rPr>
-              <w:rFonts w:ascii="Carlito" w:hAnsi="Carlito" w:eastAsia="Carlito" w:cs="Carlito"/>
+              <w:rFonts w:ascii="Carlito" w:hAnsi="Carlito" w:cs="Carlito"/>
               <w:b w:val="0"/>
               <w:bCs w:val="0"/>
               <w:color w:val="5b9bd5" w:themeColor="accent1"/>
@@ -438,7 +439,7 @@
           </w:hyperlink>
           <w:r>
             <w:rPr>
-              <w:rFonts w:ascii="Carlito" w:hAnsi="Carlito" w:eastAsia="Carlito" w:cs="Carlito"/>
+              <w:rFonts w:ascii="Carlito" w:hAnsi="Carlito" w:cs="Carlito"/>
               <w:b w:val="0"/>
               <w:bCs w:val="0"/>
               <w:color w:val="5b9bd5" w:themeColor="accent1"/>
@@ -532,7 +533,7 @@
           </w:hyperlink>
           <w:r>
             <w:rPr>
-              <w:rFonts w:ascii="Carlito" w:hAnsi="Carlito" w:eastAsia="Carlito" w:cs="Carlito"/>
+              <w:rFonts w:ascii="Carlito" w:hAnsi="Carlito" w:cs="Carlito"/>
               <w:b w:val="0"/>
               <w:bCs w:val="0"/>
               <w:color w:val="5b9bd5" w:themeColor="accent1"/>
@@ -626,7 +627,7 @@
           </w:hyperlink>
           <w:r>
             <w:rPr>
-              <w:rFonts w:ascii="Carlito" w:hAnsi="Carlito" w:eastAsia="Carlito" w:cs="Carlito"/>
+              <w:rFonts w:ascii="Carlito" w:hAnsi="Carlito" w:cs="Carlito"/>
               <w:b w:val="0"/>
               <w:bCs w:val="0"/>
               <w:color w:val="5b9bd5" w:themeColor="accent1"/>
@@ -720,7 +721,7 @@
           </w:hyperlink>
           <w:r>
             <w:rPr>
-              <w:rFonts w:ascii="Carlito" w:hAnsi="Carlito" w:eastAsia="Carlito" w:cs="Carlito"/>
+              <w:rFonts w:ascii="Carlito" w:hAnsi="Carlito" w:cs="Carlito"/>
               <w:b w:val="0"/>
               <w:bCs w:val="0"/>
               <w:color w:val="5b9bd5" w:themeColor="accent1"/>
@@ -827,7 +828,7 @@
           </w:hyperlink>
           <w:r>
             <w:rPr>
-              <w:rFonts w:ascii="Carlito" w:hAnsi="Carlito" w:eastAsia="Carlito" w:cs="Carlito"/>
+              <w:rFonts w:ascii="Carlito" w:hAnsi="Carlito" w:cs="Carlito"/>
               <w:b w:val="0"/>
               <w:bCs w:val="0"/>
               <w:color w:val="5b9bd5" w:themeColor="accent1"/>
@@ -960,7 +961,7 @@
           </w:hyperlink>
           <w:r>
             <w:rPr>
-              <w:rFonts w:ascii="Carlito" w:hAnsi="Carlito" w:eastAsia="Carlito" w:cs="Carlito"/>
+              <w:rFonts w:ascii="Carlito" w:hAnsi="Carlito" w:cs="Carlito"/>
               <w:b w:val="0"/>
               <w:bCs w:val="0"/>
               <w:color w:val="5b9bd5" w:themeColor="accent1"/>
@@ -1043,6 +1044,7 @@
       <w:r>
         <w:rPr>
           <w:highlight w:val="none"/>
+          <w14:ligatures w14:val="none"/>
         </w:rPr>
       </w:r>
       <w:r>
@@ -1071,7 +1073,7 @@
       </w:r>
       <w:r>
         <w:rPr>
-          <w:highlight w:val="none"/>
+          <w14:ligatures w14:val="none"/>
         </w:rPr>
       </w:r>
       <w:r>
@@ -1143,6 +1145,8 @@
         <w:rPr>
           <w:b/>
           <w:bCs/>
+          <w:highlight w:val="none"/>
+          <w14:ligatures w14:val="none"/>
         </w:rPr>
       </w:r>
       <w:r>
@@ -1180,6 +1184,7 @@
       <w:r>
         <w:rPr>
           <w:highlight w:val="none"/>
+          <w14:ligatures w14:val="none"/>
         </w:rPr>
       </w:r>
       <w:r>
@@ -1627,6 +1632,12 @@
           <w:szCs w:val="18"/>
         </w:rPr>
       </w:r>
+      <w:r>
+        <w:rPr>
+          <w:sz w:val="20"/>
+          <w:szCs w:val="18"/>
+        </w:rPr>
+      </w:r>
     </w:p>
     <w:p>
       <w:pPr>
@@ -1662,7 +1673,7 @@
           <w:b/>
           <w:bCs/>
           <w:color w:val="7f7f7f" w:themeColor="text1" w:themeTint="80"/>
-          <w:highlight w:val="none"/>
+          <w14:ligatures w14:val="none"/>
         </w:rPr>
       </w:r>
     </w:p>
@@ -1693,6 +1704,8 @@
           <w:b/>
           <w:bCs/>
           <w:color w:val="7f7f7f" w:themeColor="text1" w:themeTint="80"/>
+          <w:highlight w:val="none"/>
+          <w14:ligatures w14:val="none"/>
         </w:rPr>
       </w:r>
       <w:r>
@@ -2043,7 +2056,6 @@
       </w:pPr>
       <w:r/>
       <w:r/>
-      <w:r/>
     </w:p>
     <w:p>
       <w:pPr>
@@ -2098,6 +2110,7 @@
           <w:bCs/>
           <w:color w:val="7f7f7f" w:themeColor="text1" w:themeTint="80"/>
           <w:highlight w:val="none"/>
+          <w14:ligatures w14:val="none"/>
         </w:rPr>
       </w:r>
     </w:p>
@@ -2122,6 +2135,15 @@
           <w:color w:val="7f7f7f" w:themeColor="text1" w:themeTint="80"/>
         </w:rPr>
         <w:t xml:space="preserve">Pedir al usuario una ruta y comprobar si es un fichero, un directorio o no existe.</w:t>
+      </w:r>
+      <w:r>
+        <w:rPr>
+          <w:b/>
+          <w:bCs/>
+          <w:color w:val="7f7f7f" w:themeColor="text1" w:themeTint="80"/>
+          <w:highlight w:val="none"/>
+          <w14:ligatures w14:val="none"/>
+        </w:rPr>
       </w:r>
       <w:r>
         <w:rPr>
@@ -2561,6 +2583,12 @@
           <w:szCs w:val="18"/>
         </w:rPr>
       </w:r>
+      <w:r>
+        <w:rPr>
+          <w:sz w:val="20"/>
+          <w:szCs w:val="18"/>
+        </w:rPr>
+      </w:r>
     </w:p>
     <w:p>
       <w:pPr>
@@ -2623,6 +2651,7 @@
           <w:bCs/>
           <w:color w:val="7f7f7f" w:themeColor="text1" w:themeTint="80"/>
           <w:highlight w:val="none"/>
+          <w14:ligatures w14:val="none"/>
         </w:rPr>
       </w:r>
       <w:r>
@@ -2825,6 +2854,12 @@
           <w:szCs w:val="18"/>
         </w:rPr>
       </w:r>
+      <w:r>
+        <w:rPr>
+          <w:sz w:val="20"/>
+          <w:szCs w:val="18"/>
+        </w:rPr>
+      </w:r>
     </w:p>
     <w:p>
       <w:pPr>
@@ -2855,7 +2890,7 @@
     <w:p>
       <w:pPr>
         <w:pBdr/>
-        <w:shd w:val="nil"/>
+        <w:shd w:val="nil" w:color="auto"/>
         <w:spacing/>
         <w:ind/>
         <w:rPr>
@@ -2889,6 +2924,7 @@
           <w:bCs/>
           <w:color w:val="7f7f7f" w:themeColor="text1" w:themeTint="80"/>
           <w:highlight w:val="none"/>
+          <w14:ligatures w14:val="none"/>
         </w:rPr>
       </w:r>
     </w:p>
@@ -2928,6 +2964,7 @@
           <w:bCs/>
           <w:color w:val="7f7f7f" w:themeColor="text1" w:themeTint="80"/>
           <w:highlight w:val="none"/>
+          <w14:ligatures w14:val="none"/>
         </w:rPr>
       </w:r>
       <w:r>
@@ -3703,6 +3740,12 @@
           <w:szCs w:val="18"/>
         </w:rPr>
       </w:r>
+      <w:r>
+        <w:rPr>
+          <w:sz w:val="20"/>
+          <w:szCs w:val="18"/>
+        </w:rPr>
+      </w:r>
     </w:p>
     <w:p>
       <w:pPr>
@@ -3758,6 +3801,7 @@
           <w:bCs/>
           <w:color w:val="7f7f7f" w:themeColor="text1" w:themeTint="80"/>
           <w:highlight w:val="none"/>
+          <w14:ligatures w14:val="none"/>
         </w:rPr>
       </w:r>
       <w:r>
@@ -3798,6 +3842,33 @@
           <w:bCs/>
           <w:color w:val="7f7f7f" w:themeColor="text1" w:themeTint="80"/>
           <w:highlight w:val="none"/>
+          <w14:ligatures w14:val="none"/>
+        </w:rPr>
+      </w:r>
+      <w:r>
+        <w:rPr>
+          <w:b/>
+          <w:bCs/>
+          <w:color w:val="7f7f7f" w:themeColor="text1" w:themeTint="80"/>
+          <w:highlight w:val="none"/>
+          <w14:ligatures w14:val="none"/>
+        </w:rPr>
+      </w:r>
+      <w:r>
+        <w:rPr>
+          <w:highlight w:val="none"/>
+        </w:rPr>
+      </w:r>
+      <w:r>
+        <w:rPr>
+          <w:highlight w:val="none"/>
+          <w14:ligatures w14:val="none"/>
+        </w:rPr>
+      </w:r>
+      <w:r>
+        <w:rPr>
+          <w:highlight w:val="none"/>
+          <w14:ligatures w14:val="none"/>
         </w:rPr>
       </w:r>
       <w:r>
@@ -3812,177 +3883,6 @@
     </w:p>
     <w:p>
       <w:pPr>
-        <w:pStyle w:val="855"/>
-        <w:pBdr/>
-        <w:spacing/>
-        <w:ind/>
-        <w:rPr>
-          <w:b/>
-          <w:bCs/>
-          <w:color w:val="7f7f7f" w:themeColor="text1" w:themeTint="80"/>
-          <w:highlight w:val="none"/>
-          <w14:ligatures w14:val="none"/>
-        </w:rPr>
-      </w:pPr>
-      <w:r>
-        <w:rPr>
-          <w:b/>
-          <w:bCs/>
-          <w:color w:val="7f7f7f" w:themeColor="text1" w:themeTint="80"/>
-        </w:rPr>
-        <w:t xml:space="preserve">Crear un programa que renombre todos los archivos de una carpeta aplicando un </w:t>
-      </w:r>
-      <w:r>
-        <w:rPr>
-          <w:b/>
-          <w:bCs/>
-          <w:color w:val="7f7f7f" w:themeColor="text1" w:themeTint="80"/>
-        </w:rPr>
-        <w:t xml:space="preserve">formato específico (por ejemplo: IMG_001.jpg, IMG_002.jpg, etc.).</w:t>
-      </w:r>
-      <w:r>
-        <w:rPr>
-          <w:b/>
-          <w:bCs/>
-          <w:color w:val="7f7f7f" w:themeColor="text1" w:themeTint="80"/>
-          <w:highlight w:val="none"/>
-        </w:rPr>
-      </w:r>
-      <w:r>
-        <w:rPr>
-          <w:b/>
-          <w:bCs/>
-          <w:color w:val="7f7f7f" w:themeColor="text1" w:themeTint="80"/>
-          <w:highlight w:val="none"/>
-          <w14:ligatures w14:val="none"/>
-        </w:rPr>
-      </w:r>
-    </w:p>
-    <w:p>
-      <w:pPr>
-        <w:pStyle w:val="855"/>
-        <w:pBdr/>
-        <w:spacing/>
-        <w:ind/>
-        <w:rPr>
-          <w:b/>
-          <w:bCs/>
-          <w:color w:val="7f7f7f" w:themeColor="text1" w:themeTint="80"/>
-          <w:highlight w:val="none"/>
-          <w14:ligatures w14:val="none"/>
-        </w:rPr>
-      </w:pPr>
-      <w:r>
-        <w:rPr>
-          <w:b/>
-          <w:bCs/>
-          <w:color w:val="7f7f7f" w:themeColor="text1" w:themeTint="80"/>
-        </w:rPr>
-        <w:t xml:space="preserve">Buscar en un directorio y subdirectorios todos los archivos que contengan una palabra </w:t>
-      </w:r>
-      <w:r>
-        <w:rPr>
-          <w:b/>
-          <w:bCs/>
-          <w:color w:val="7f7f7f" w:themeColor="text1" w:themeTint="80"/>
-        </w:rPr>
-        <w:t xml:space="preserve">clave en su nombre.</w:t>
-      </w:r>
-      <w:r>
-        <w:rPr>
-          <w:b/>
-          <w:bCs/>
-          <w:color w:val="7f7f7f" w:themeColor="text1" w:themeTint="80"/>
-          <w:highlight w:val="none"/>
-        </w:rPr>
-      </w:r>
-      <w:r>
-        <w:rPr>
-          <w:b/>
-          <w:bCs/>
-          <w:color w:val="7f7f7f" w:themeColor="text1" w:themeTint="80"/>
-          <w:highlight w:val="none"/>
-          <w14:ligatures w14:val="none"/>
-        </w:rPr>
-      </w:r>
-    </w:p>
-    <w:p>
-      <w:pPr>
-        <w:pStyle w:val="855"/>
-        <w:pBdr/>
-        <w:spacing/>
-        <w:ind/>
-        <w:rPr>
-          <w:b/>
-          <w:bCs/>
-          <w:color w:val="7f7f7f" w:themeColor="text1" w:themeTint="80"/>
-          <w:highlight w:val="none"/>
-          <w14:ligatures w14:val="none"/>
-        </w:rPr>
-      </w:pPr>
-      <w:r>
-        <w:rPr>
-          <w:b/>
-          <w:bCs/>
-          <w:color w:val="7f7f7f" w:themeColor="text1" w:themeTint="80"/>
-        </w:rPr>
-        <w:t xml:space="preserve">Crear un historial de los ficheros creados, modificados o eliminados en una </w:t>
-      </w:r>
-      <w:r>
-        <w:rPr>
-          <w:b/>
-          <w:bCs/>
-          <w:color w:val="7f7f7f" w:themeColor="text1" w:themeTint="80"/>
-        </w:rPr>
-        <w:t xml:space="preserve">carpeta (simulación de un sistema de monitoreo).</w:t>
-      </w:r>
-      <w:r>
-        <w:rPr>
-          <w:b/>
-          <w:bCs/>
-          <w:color w:val="7f7f7f" w:themeColor="text1" w:themeTint="80"/>
-        </w:rPr>
-      </w:r>
-      <w:r>
-        <w:rPr>
-          <w:b/>
-          <w:bCs/>
-          <w:color w:val="7f7f7f" w:themeColor="text1" w:themeTint="80"/>
-          <w:highlight w:val="none"/>
-          <w14:ligatures w14:val="none"/>
-        </w:rPr>
-      </w:r>
-    </w:p>
-    <w:p>
-      <w:pPr>
-        <w:pBdr/>
-        <w:shd w:val="nil" w:color="auto"/>
-        <w:spacing/>
-        <w:ind/>
-        <w:rPr>
-          <w:highlight w:val="none"/>
-          <w14:ligatures w14:val="none"/>
-        </w:rPr>
-      </w:pPr>
-      <w:r>
-        <w:rPr>
-          <w:highlight w:val="none"/>
-        </w:rPr>
-      </w:r>
-      <w:r>
-        <w:rPr>
-          <w:highlight w:val="none"/>
-        </w:rPr>
-      </w:r>
-      <w:r>
-        <w:rPr>
-          <w:highlight w:val="none"/>
-          <w14:ligatures w14:val="none"/>
-        </w:rPr>
-      </w:r>
-    </w:p>
-    <w:p>
-      <w:pPr>
         <w:pBdr/>
         <w:shd w:val="nil" w:color="auto"/>
         <w:spacing/>
@@ -3999,7 +3899,7 @@
       </w:r>
       <w:r>
         <w:rPr>
-          <w:highlight w:val="none"/>
+          <w14:ligatures w14:val="none"/>
         </w:rPr>
       </w:r>
       <w:r>
@@ -4028,7 +3928,12 @@
         <w:t xml:space="preserve">acceso</w:t>
       </w:r>
       <w:bookmarkEnd w:id="2"/>
-      <w:r/>
+      <w:r>
+        <w:rPr>
+          <w:highlight w:val="none"/>
+          <w14:ligatures w14:val="none"/>
+        </w:rPr>
+      </w:r>
       <w:r>
         <w:rPr>
           <w:highlight w:val="none"/>
@@ -4057,6 +3962,11 @@
           <w14:ligatures w14:val="none"/>
         </w:rPr>
       </w:r>
+      <w:r>
+        <w:rPr>
+          <w14:ligatures w14:val="none"/>
+        </w:rPr>
+      </w:r>
     </w:p>
     <w:p>
       <w:pPr>
@@ -4079,6 +3989,11 @@
           <w14:ligatures w14:val="none"/>
         </w:rPr>
       </w:r>
+      <w:r>
+        <w:rPr>
+          <w14:ligatures w14:val="none"/>
+        </w:rPr>
+      </w:r>
     </w:p>
     <w:p>
       <w:pPr>
@@ -4101,6 +4016,11 @@
           <w14:ligatures w14:val="none"/>
         </w:rPr>
       </w:r>
+      <w:r>
+        <w:rPr>
+          <w14:ligatures w14:val="none"/>
+        </w:rPr>
+      </w:r>
     </w:p>
     <w:p>
       <w:pPr>
@@ -4123,6 +4043,11 @@
           <w14:ligatures w14:val="none"/>
         </w:rPr>
       </w:r>
+      <w:r>
+        <w:rPr>
+          <w14:ligatures w14:val="none"/>
+        </w:rPr>
+      </w:r>
     </w:p>
     <w:p>
       <w:pPr>
@@ -4145,6 +4070,11 @@
           <w14:ligatures w14:val="none"/>
         </w:rPr>
       </w:r>
+      <w:r>
+        <w:rPr>
+          <w14:ligatures w14:val="none"/>
+        </w:rPr>
+      </w:r>
     </w:p>
     <w:p>
       <w:pPr>
@@ -4167,105 +4097,11 @@
           <w14:ligatures w14:val="none"/>
         </w:rPr>
       </w:r>
-    </w:p>
-    <w:p>
-      <w:pPr>
-        <w:pStyle w:val="855"/>
-        <w:pBdr/>
-        <w:spacing/>
-        <w:ind/>
-        <w:rPr>
-          <w14:ligatures w14:val="none"/>
-        </w:rPr>
-      </w:pPr>
-      <w:r>
-        <w:t xml:space="preserve">Diseñar una pequeña base de datos de empleados usando acceso aleatorio. Permitir </w:t>
-      </w:r>
-      <w:r>
-        <w:t xml:space="preserve">búsqueda por ID.</w:t>
-      </w:r>
       <w:r>
         <w:rPr>
           <w14:ligatures w14:val="none"/>
         </w:rPr>
       </w:r>
-    </w:p>
-    <w:p>
-      <w:pPr>
-        <w:pStyle w:val="855"/>
-        <w:pBdr/>
-        <w:spacing/>
-        <w:ind/>
-        <w:rPr>
-          <w14:ligatures w14:val="none"/>
-        </w:rPr>
-      </w:pPr>
-      <w:r>
-        <w:t xml:space="preserve">Implementar una herramienta que lea un fichero de texto, pero que permita saltar a </w:t>
-      </w:r>
-      <w:r>
-        <w:t xml:space="preserve">una línea específica usando un índice generado previamente.</w:t>
-      </w:r>
-      <w:r>
-        <w:rPr>
-          <w14:ligatures w14:val="none"/>
-        </w:rPr>
-      </w:r>
-    </w:p>
-    <w:p>
-      <w:pPr>
-        <w:pStyle w:val="855"/>
-        <w:pBdr/>
-        <w:spacing/>
-        <w:ind/>
-        <w:rPr>
-          <w14:ligatures w14:val="none"/>
-        </w:rPr>
-      </w:pPr>
-      <w:r>
-        <w:t xml:space="preserve">Simular un sistema de reservas con acceso aleatorio a un fichero binario de asientos de </w:t>
-      </w:r>
-      <w:r>
-        <w:t xml:space="preserve">avión.</w:t>
-      </w:r>
-      <w:r>
-        <w:rPr>
-          <w14:ligatures w14:val="none"/>
-        </w:rPr>
-      </w:r>
-    </w:p>
-    <w:p>
-      <w:pPr>
-        <w:pStyle w:val="855"/>
-        <w:pBdr/>
-        <w:spacing/>
-        <w:ind/>
-        <w:rPr>
-          <w14:ligatures w14:val="none"/>
-        </w:rPr>
-      </w:pPr>
-      <w:r>
-        <w:t xml:space="preserve">Guardar logs secuenciales y luego extraer solo los de un rango de fechas, </w:t>
-      </w:r>
-      <w:r>
-        <w:t xml:space="preserve">comparando eficiencia frente a binarios.</w:t>
-      </w:r>
-      <w:r>
-        <w:rPr>
-          <w14:ligatures w14:val="none"/>
-        </w:rPr>
-      </w:r>
-    </w:p>
-    <w:p>
-      <w:pPr>
-        <w:pBdr/>
-        <w:shd w:val="nil" w:color="auto"/>
-        <w:spacing/>
-        <w:ind/>
-        <w:rPr>
-          <w14:ligatures w14:val="none"/>
-        </w:rPr>
-      </w:pPr>
       <w:r>
         <w:rPr>
           <w:highlight w:val="none"/>
@@ -4274,7 +4110,12 @@
       </w:r>
       <w:r>
         <w:rPr>
-          <w:highlight w:val="none"/>
+          <w14:ligatures w14:val="none"/>
+        </w:rPr>
+      </w:r>
+      <w:r>
+        <w:rPr>
+          <w14:ligatures w14:val="none"/>
         </w:rPr>
       </w:r>
       <w:r>
@@ -4300,7 +4141,12 @@
         <w:t xml:space="preserve">Recuperar información almacenada en ficheros</w:t>
       </w:r>
       <w:bookmarkEnd w:id="3"/>
-      <w:r/>
+      <w:r>
+        <w:rPr>
+          <w:highlight w:val="none"/>
+          <w14:ligatures w14:val="none"/>
+        </w:rPr>
+      </w:r>
       <w:r>
         <w:rPr>
           <w:highlight w:val="none"/>
@@ -4329,6 +4175,11 @@
           <w14:ligatures w14:val="none"/>
         </w:rPr>
       </w:r>
+      <w:r>
+        <w:rPr>
+          <w14:ligatures w14:val="none"/>
+        </w:rPr>
+      </w:r>
     </w:p>
     <w:p>
       <w:pPr>
@@ -4348,19 +4199,29 @@
           <w14:ligatures w14:val="none"/>
         </w:rPr>
       </w:r>
-    </w:p>
-    <w:p>
-      <w:pPr>
-        <w:pStyle w:val="855"/>
-        <w:pBdr/>
-        <w:spacing/>
-        <w:ind/>
+      <w:r>
         <w:rPr>
           <w14:ligatures w14:val="none"/>
         </w:rPr>
+      </w:r>
+    </w:p>
+    <w:p>
+      <w:pPr>
+        <w:pStyle w:val="855"/>
+        <w:pBdr/>
+        <w:spacing/>
+        <w:ind/>
+        <w:rPr>
+          <w14:ligatures w14:val="none"/>
+        </w:rPr>
       </w:pPr>
       <w:r>
         <w:t xml:space="preserve">Leer datos binarios y convertirlos a un formato legible en consola.</w:t>
+      </w:r>
+      <w:r>
+        <w:rPr>
+          <w14:ligatures w14:val="none"/>
+        </w:rPr>
       </w:r>
       <w:r>
         <w:rPr>
@@ -4389,143 +4250,11 @@
           <w14:ligatures w14:val="none"/>
         </w:rPr>
       </w:r>
-    </w:p>
-    <w:p>
-      <w:pPr>
-        <w:pStyle w:val="855"/>
-        <w:pBdr/>
-        <w:spacing/>
-        <w:ind/>
-        <w:rPr>
-          <w14:ligatures w14:val="none"/>
-        </w:rPr>
-      </w:pPr>
-      <w:r>
-        <w:t xml:space="preserve">Leer un fichero JSON (usando librerías externas como Gson) y convertirlo en objetos </w:t>
-      </w:r>
-      <w:r>
-        <w:t xml:space="preserve">Java.</w:t>
-      </w:r>
       <w:r>
         <w:rPr>
           <w14:ligatures w14:val="none"/>
         </w:rPr>
       </w:r>
-    </w:p>
-    <w:p>
-      <w:pPr>
-        <w:pStyle w:val="855"/>
-        <w:pBdr/>
-        <w:spacing/>
-        <w:ind/>
-        <w:rPr>
-          <w14:ligatures w14:val="none"/>
-        </w:rPr>
-      </w:pPr>
-      <w:r>
-        <w:t xml:space="preserve">Leer un fichero con errores de formato y capturar las excepciones sin detener el </w:t>
-      </w:r>
-      <w:r>
-        <w:t xml:space="preserve">programa.</w:t>
-      </w:r>
-      <w:r>
-        <w:rPr>
-          <w14:ligatures w14:val="none"/>
-        </w:rPr>
-      </w:r>
-    </w:p>
-    <w:p>
-      <w:pPr>
-        <w:pStyle w:val="855"/>
-        <w:pBdr/>
-        <w:spacing/>
-        <w:ind/>
-        <w:rPr>
-          <w14:ligatures w14:val="none"/>
-        </w:rPr>
-      </w:pPr>
-      <w:r>
-        <w:t xml:space="preserve">Cargar un fichero binario de productos y permitir buscarlos por nombre o código.</w:t>
-      </w:r>
-      <w:r>
-        <w:rPr>
-          <w14:ligatures w14:val="none"/>
-        </w:rPr>
-      </w:r>
-    </w:p>
-    <w:p>
-      <w:pPr>
-        <w:pStyle w:val="855"/>
-        <w:pBdr/>
-        <w:spacing/>
-        <w:ind/>
-        <w:rPr>
-          <w14:ligatures w14:val="none"/>
-        </w:rPr>
-      </w:pPr>
-      <w:r>
-        <w:t xml:space="preserve">Leer un fichero de configuración (config.properties) y mostrar los valores en consola.</w:t>
-      </w:r>
-      <w:r>
-        <w:rPr>
-          <w14:ligatures w14:val="none"/>
-        </w:rPr>
-      </w:r>
-    </w:p>
-    <w:p>
-      <w:pPr>
-        <w:pStyle w:val="855"/>
-        <w:pBdr/>
-        <w:spacing/>
-        <w:ind/>
-        <w:rPr>
-          <w14:ligatures w14:val="none"/>
-        </w:rPr>
-      </w:pPr>
-      <w:r>
-        <w:t xml:space="preserve">Leer un fichero de texto con líneas que contienen expresiones matemáticas y </w:t>
-      </w:r>
-      <w:r>
-        <w:t xml:space="preserve">evaluarlas.</w:t>
-      </w:r>
-      <w:r>
-        <w:rPr>
-          <w14:ligatures w14:val="none"/>
-        </w:rPr>
-      </w:r>
-    </w:p>
-    <w:p>
-      <w:pPr>
-        <w:pStyle w:val="855"/>
-        <w:pBdr/>
-        <w:spacing/>
-        <w:ind/>
-        <w:rPr>
-          <w14:ligatures w14:val="none"/>
-        </w:rPr>
-      </w:pPr>
-      <w:r>
-        <w:t xml:space="preserve">Cargar un fichero que contiene logs de una aplicación, agruparlos por tipo </w:t>
-      </w:r>
-      <w:r>
-        <w:t xml:space="preserve">(INFO, ERROR, DEBUG, etc.).</w:t>
-      </w:r>
-      <w:r>
-        <w:rPr>
-          <w14:ligatures w14:val="none"/>
-        </w:rPr>
-      </w:r>
-    </w:p>
-    <w:p>
-      <w:pPr>
-        <w:pBdr/>
-        <w:shd w:val="nil" w:color="auto"/>
-        <w:spacing/>
-        <w:ind/>
-        <w:rPr>
-          <w14:ligatures w14:val="none"/>
-        </w:rPr>
-      </w:pPr>
       <w:r>
         <w:rPr>
           <w:highlight w:val="none"/>
@@ -4534,7 +4263,12 @@
       </w:r>
       <w:r>
         <w:rPr>
-          <w:highlight w:val="none"/>
+          <w14:ligatures w14:val="none"/>
+        </w:rPr>
+      </w:r>
+      <w:r>
+        <w:rPr>
+          <w14:ligatures w14:val="none"/>
         </w:rPr>
       </w:r>
       <w:r>
@@ -4560,7 +4294,12 @@
         <w:t xml:space="preserve">Almacenar información en ficheros</w:t>
       </w:r>
       <w:bookmarkEnd w:id="4"/>
-      <w:r/>
+      <w:r>
+        <w:rPr>
+          <w:highlight w:val="none"/>
+          <w14:ligatures w14:val="none"/>
+        </w:rPr>
+      </w:r>
       <w:r>
         <w:rPr>
           <w:highlight w:val="none"/>
@@ -4580,6 +4319,11 @@
       </w:pPr>
       <w:r>
         <w:t xml:space="preserve">Guardar una lista de objetos Producto en un fichero de texto en formato CSV.</w:t>
+      </w:r>
+      <w:r>
+        <w:rPr>
+          <w14:ligatures w14:val="none"/>
+        </w:rPr>
       </w:r>
       <w:r>
         <w:rPr>
@@ -4608,6 +4352,11 @@
           <w14:ligatures w14:val="none"/>
         </w:rPr>
       </w:r>
+      <w:r>
+        <w:rPr>
+          <w14:ligatures w14:val="none"/>
+        </w:rPr>
+      </w:r>
     </w:p>
     <w:p>
       <w:pPr>
@@ -4626,45 +4375,6 @@
         <w:rPr>
           <w14:ligatures w14:val="none"/>
         </w:rPr>
-      </w:r>
-    </w:p>
-    <w:p>
-      <w:pPr>
-        <w:pStyle w:val="855"/>
-        <w:pBdr/>
-        <w:spacing/>
-        <w:ind/>
-        <w:rPr>
-          <w14:ligatures w14:val="none"/>
-        </w:rPr>
-      </w:pPr>
-      <w:r>
-        <w:t xml:space="preserve">Crear un fichero log.txt que guarde todos los errores que ocurran en tiempo de </w:t>
-      </w:r>
-      <w:r>
-        <w:t xml:space="preserve">ejecución.</w:t>
-      </w:r>
-      <w:r>
-        <w:rPr>
-          <w14:ligatures w14:val="none"/>
-        </w:rPr>
-      </w:r>
-    </w:p>
-    <w:p>
-      <w:pPr>
-        <w:pStyle w:val="855"/>
-        <w:pBdr/>
-        <w:spacing/>
-        <w:ind/>
-        <w:rPr>
-          <w14:ligatures w14:val="none"/>
-        </w:rPr>
-      </w:pPr>
-      <w:r>
-        <w:t xml:space="preserve">Escribir en un fichero la información ingresada por el usuario desde la consola hasta </w:t>
-      </w:r>
-      <w:r>
-        <w:t xml:space="preserve">que escriba “FIN”.</w:t>
       </w:r>
       <w:r>
         <w:rPr>
@@ -4693,99 +4403,11 @@
           <w14:ligatures w14:val="none"/>
         </w:rPr>
       </w:r>
-    </w:p>
-    <w:p>
-      <w:pPr>
-        <w:pStyle w:val="855"/>
-        <w:pBdr/>
-        <w:spacing/>
-        <w:ind/>
-        <w:rPr>
-          <w14:ligatures w14:val="none"/>
-        </w:rPr>
-      </w:pPr>
-      <w:r>
-        <w:t xml:space="preserve">Escribir un fichero de texto que contenga una tabla formateada (como una factura o </w:t>
-      </w:r>
-      <w:r>
-        <w:t xml:space="preserve">listado con columnas).</w:t>
-      </w:r>
       <w:r>
         <w:rPr>
           <w14:ligatures w14:val="none"/>
         </w:rPr>
       </w:r>
-    </w:p>
-    <w:p>
-      <w:pPr>
-        <w:pStyle w:val="855"/>
-        <w:pBdr/>
-        <w:spacing/>
-        <w:ind/>
-        <w:rPr>
-          <w14:ligatures w14:val="none"/>
-        </w:rPr>
-      </w:pPr>
-      <w:r>
-        <w:t xml:space="preserve">Serializar objetos con atributos anidados (por ejemplo, Alumno que contiene Direccion).</w:t>
-      </w:r>
-      <w:r>
-        <w:rPr>
-          <w14:ligatures w14:val="none"/>
-        </w:rPr>
-      </w:r>
-    </w:p>
-    <w:p>
-      <w:pPr>
-        <w:pStyle w:val="855"/>
-        <w:pBdr/>
-        <w:spacing/>
-        <w:ind/>
-        <w:rPr>
-          <w14:ligatures w14:val="none"/>
-        </w:rPr>
-      </w:pPr>
-      <w:r>
-        <w:t xml:space="preserve">Guardar un fichero CSV con separador personalizado (; en vez de ,).</w:t>
-      </w:r>
-      <w:r>
-        <w:rPr>
-          <w14:ligatures w14:val="none"/>
-        </w:rPr>
-      </w:r>
-    </w:p>
-    <w:p>
-      <w:pPr>
-        <w:pStyle w:val="855"/>
-        <w:pBdr/>
-        <w:spacing/>
-        <w:ind/>
-        <w:rPr>
-          <w14:ligatures w14:val="none"/>
-        </w:rPr>
-      </w:pPr>
-      <w:r>
-        <w:t xml:space="preserve">Simular una base de datos simple: guardar, modificar y eliminar datos </w:t>
-      </w:r>
-      <w:r>
-        <w:t xml:space="preserve">persistentes usando serialización.</w:t>
-      </w:r>
-      <w:r>
-        <w:rPr>
-          <w14:ligatures w14:val="none"/>
-        </w:rPr>
-      </w:r>
-    </w:p>
-    <w:p>
-      <w:pPr>
-        <w:pBdr/>
-        <w:shd w:val="nil" w:color="auto"/>
-        <w:spacing/>
-        <w:ind/>
-        <w:rPr>
-          <w14:ligatures w14:val="none"/>
-        </w:rPr>
-      </w:pPr>
       <w:r>
         <w:rPr>
           <w:highlight w:val="none"/>
@@ -4794,7 +4416,12 @@
       </w:r>
       <w:r>
         <w:rPr>
-          <w:highlight w:val="none"/>
+          <w14:ligatures w14:val="none"/>
+        </w:rPr>
+      </w:r>
+      <w:r>
+        <w:rPr>
+          <w14:ligatures w14:val="none"/>
         </w:rPr>
       </w:r>
       <w:r>
@@ -4820,7 +4447,12 @@
         <w:t xml:space="preserve">Conversiones entre diferentes formatos de ficheros</w:t>
       </w:r>
       <w:bookmarkEnd w:id="5"/>
-      <w:r/>
+      <w:r>
+        <w:rPr>
+          <w:highlight w:val="none"/>
+          <w14:ligatures w14:val="none"/>
+        </w:rPr>
+      </w:r>
       <w:r>
         <w:rPr>
           <w:highlight w:val="none"/>
@@ -4844,208 +4476,6 @@
       <w:r>
         <w:rPr>
           <w14:ligatures w14:val="none"/>
-        </w:rPr>
-      </w:r>
-    </w:p>
-    <w:p>
-      <w:pPr>
-        <w:pStyle w:val="855"/>
-        <w:pBdr/>
-        <w:spacing/>
-        <w:ind/>
-        <w:rPr>
-          <w14:ligatures w14:val="none"/>
-        </w:rPr>
-      </w:pPr>
-      <w:r>
-        <w:t xml:space="preserve">Convertir un fichero binario a un fichero de texto legible para exportación.</w:t>
-      </w:r>
-      <w:r>
-        <w:rPr>
-          <w14:ligatures w14:val="none"/>
-        </w:rPr>
-      </w:r>
-    </w:p>
-    <w:p>
-      <w:pPr>
-        <w:pStyle w:val="855"/>
-        <w:pBdr/>
-        <w:spacing/>
-        <w:ind/>
-        <w:rPr>
-          <w14:ligatures w14:val="none"/>
-        </w:rPr>
-      </w:pPr>
-      <w:r>
-        <w:t xml:space="preserve">Cargar objetos desde un fichero .dat y exportarlos a CSV.</w:t>
-      </w:r>
-      <w:r>
-        <w:rPr>
-          <w14:ligatures w14:val="none"/>
-        </w:rPr>
-      </w:r>
-    </w:p>
-    <w:p>
-      <w:pPr>
-        <w:pStyle w:val="855"/>
-        <w:pBdr/>
-        <w:spacing/>
-        <w:ind/>
-        <w:rPr>
-          <w14:ligatures w14:val="none"/>
-        </w:rPr>
-      </w:pPr>
-      <w:r>
-        <w:t xml:space="preserve">Convertir un fichero de texto con estructura XML a objetos Java y viceversa (con </w:t>
-      </w:r>
-      <w:r>
-        <w:t xml:space="preserve">JAXB).</w:t>
-      </w:r>
-      <w:r>
-        <w:rPr>
-          <w14:ligatures w14:val="none"/>
-        </w:rPr>
-      </w:r>
-    </w:p>
-    <w:p>
-      <w:pPr>
-        <w:pStyle w:val="855"/>
-        <w:pBdr/>
-        <w:spacing/>
-        <w:ind/>
-        <w:rPr>
-          <w14:ligatures w14:val="none"/>
-        </w:rPr>
-      </w:pPr>
-      <w:r>
-        <w:t xml:space="preserve">Leer un fichero JSON y exportarlo como CSV (requiere uso de librerías).</w:t>
-      </w:r>
-      <w:r>
-        <w:rPr>
-          <w14:ligatures w14:val="none"/>
-        </w:rPr>
-      </w:r>
-    </w:p>
-    <w:p>
-      <w:pPr>
-        <w:pStyle w:val="855"/>
-        <w:pBdr/>
-        <w:spacing/>
-        <w:ind/>
-        <w:rPr>
-          <w14:ligatures w14:val="none"/>
-        </w:rPr>
-      </w:pPr>
-      <w:r>
-        <w:t xml:space="preserve">Convertir un listado de objetos serializados a texto tabulado (formato tipo Excel).</w:t>
-      </w:r>
-      <w:r>
-        <w:rPr>
-          <w14:ligatures w14:val="none"/>
-        </w:rPr>
-      </w:r>
-    </w:p>
-    <w:p>
-      <w:pPr>
-        <w:pStyle w:val="855"/>
-        <w:pBdr/>
-        <w:spacing/>
-        <w:ind/>
-        <w:rPr>
-          <w14:ligatures w14:val="none"/>
-        </w:rPr>
-      </w:pPr>
-      <w:r>
-        <w:t xml:space="preserve">Crear un programa que lea un CSV de usuarios y lo convierta a un fichero JSON.</w:t>
-      </w:r>
-      <w:r>
-        <w:rPr>
-          <w14:ligatures w14:val="none"/>
-        </w:rPr>
-      </w:r>
-    </w:p>
-    <w:p>
-      <w:pPr>
-        <w:pStyle w:val="855"/>
-        <w:pBdr/>
-        <w:spacing/>
-        <w:ind/>
-        <w:rPr>
-          <w14:ligatures w14:val="none"/>
-        </w:rPr>
-      </w:pPr>
-      <w:r>
-        <w:t xml:space="preserve">Hacer backup automático de un fichero de texto en formato binario.</w:t>
-      </w:r>
-      <w:r>
-        <w:rPr>
-          <w14:ligatures w14:val="none"/>
-        </w:rPr>
-      </w:r>
-    </w:p>
-    <w:p>
-      <w:pPr>
-        <w:pStyle w:val="855"/>
-        <w:pBdr/>
-        <w:spacing/>
-        <w:ind/>
-        <w:rPr>
-          <w14:ligatures w14:val="none"/>
-        </w:rPr>
-      </w:pPr>
-      <w:r>
-        <w:t xml:space="preserve">Convertir un fichero de texto con datos en formato personalizado a objetos y luego a </w:t>
-      </w:r>
-      <w:r>
-        <w:t xml:space="preserve">binario.</w:t>
-      </w:r>
-      <w:r>
-        <w:rPr>
-          <w14:ligatures w14:val="none"/>
-        </w:rPr>
-      </w:r>
-    </w:p>
-    <w:p>
-      <w:pPr>
-        <w:pStyle w:val="855"/>
-        <w:pBdr/>
-        <w:spacing/>
-        <w:ind/>
-        <w:rPr>
-          <w14:ligatures w14:val="none"/>
-        </w:rPr>
-      </w:pPr>
-      <w:r>
-        <w:t xml:space="preserve">Leer registros de un fichero binario y exportarlos a una página HTML con </w:t>
-      </w:r>
-      <w:r>
-        <w:t xml:space="preserve">formato de tabla.</w:t>
-      </w:r>
-      <w:r>
-        <w:rPr>
-          <w14:ligatures w14:val="none"/>
-        </w:rPr>
-      </w:r>
-    </w:p>
-    <w:p>
-      <w:pPr>
-        <w:pBdr/>
-        <w:shd w:val="nil" w:color="auto"/>
-        <w:spacing/>
-        <w:ind/>
-        <w:rPr>
-          <w14:ligatures w14:val="none"/>
-        </w:rPr>
-      </w:pPr>
-      <w:r>
-        <w:rPr>
-          <w:highlight w:val="none"/>
-        </w:rPr>
-        <w:br w:type="page" w:clear="all"/>
-      </w:r>
-      <w:r>
-        <w:rPr>
-          <w:highlight w:val="none"/>
         </w:rPr>
       </w:r>
       <w:r>
@@ -5056,6 +4486,75 @@
     </w:p>
     <w:p>
       <w:pPr>
+        <w:pStyle w:val="855"/>
+        <w:pBdr/>
+        <w:spacing/>
+        <w:ind/>
+        <w:rPr>
+          <w14:ligatures w14:val="none"/>
+        </w:rPr>
+      </w:pPr>
+      <w:r>
+        <w:t xml:space="preserve">Convertir un fichero binario a un fichero de texto legible para exportación.</w:t>
+      </w:r>
+      <w:r>
+        <w:rPr>
+          <w14:ligatures w14:val="none"/>
+        </w:rPr>
+      </w:r>
+      <w:r>
+        <w:rPr>
+          <w14:ligatures w14:val="none"/>
+        </w:rPr>
+      </w:r>
+    </w:p>
+    <w:p>
+      <w:pPr>
+        <w:pStyle w:val="855"/>
+        <w:pBdr/>
+        <w:spacing/>
+        <w:ind/>
+        <w:rPr>
+          <w14:ligatures w14:val="none"/>
+        </w:rPr>
+      </w:pPr>
+      <w:r>
+        <w:t xml:space="preserve">Cargar objetos desde un fichero .dat y exportarlos a CSV.</w:t>
+      </w:r>
+      <w:r>
+        <w:rPr>
+          <w14:ligatures w14:val="none"/>
+        </w:rPr>
+      </w:r>
+      <w:r>
+        <w:rPr>
+          <w14:ligatures w14:val="none"/>
+        </w:rPr>
+      </w:r>
+      <w:r>
+        <w:rPr>
+          <w:highlight w:val="none"/>
+        </w:rPr>
+        <w:br w:type="page" w:clear="all"/>
+      </w:r>
+      <w:r>
+        <w:rPr>
+          <w14:ligatures w14:val="none"/>
+        </w:rPr>
+      </w:r>
+      <w:r>
+        <w:rPr>
+          <w14:ligatures w14:val="none"/>
+        </w:rPr>
+      </w:r>
+      <w:r>
+        <w:rPr>
+          <w14:ligatures w14:val="none"/>
+        </w:rPr>
+      </w:r>
+    </w:p>
+    <w:p>
+      <w:pPr>
         <w:pStyle w:val="851"/>
         <w:pBdr/>
         <w:spacing/>
@@ -5074,7 +4573,12 @@
         <w:t xml:space="preserve">previsto y gestionado las excepciones</w:t>
       </w:r>
       <w:bookmarkEnd w:id="6"/>
-      <w:r/>
+      <w:r>
+        <w:rPr>
+          <w:highlight w:val="none"/>
+          <w14:ligatures w14:val="none"/>
+        </w:rPr>
+      </w:r>
       <w:r>
         <w:rPr>
           <w:highlight w:val="none"/>
@@ -5103,6 +4607,11 @@
           <w14:ligatures w14:val="none"/>
         </w:rPr>
       </w:r>
+      <w:r>
+        <w:rPr>
+          <w14:ligatures w14:val="none"/>
+        </w:rPr>
+      </w:r>
     </w:p>
     <w:p>
       <w:pPr>
@@ -5125,6 +4634,11 @@
           <w14:ligatures w14:val="none"/>
         </w:rPr>
       </w:r>
+      <w:r>
+        <w:rPr>
+          <w14:ligatures w14:val="none"/>
+        </w:rPr>
+      </w:r>
     </w:p>
     <w:p>
       <w:pPr>
@@ -5147,6 +4661,11 @@
           <w14:ligatures w14:val="none"/>
         </w:rPr>
       </w:r>
+      <w:r>
+        <w:rPr>
+          <w14:ligatures w14:val="none"/>
+        </w:rPr>
+      </w:r>
     </w:p>
     <w:p>
       <w:pPr>
@@ -5166,6 +4685,11 @@
           <w14:ligatures w14:val="none"/>
         </w:rPr>
       </w:r>
+      <w:r>
+        <w:rPr>
+          <w14:ligatures w14:val="none"/>
+        </w:rPr>
+      </w:r>
     </w:p>
     <w:p>
       <w:pPr>
@@ -5185,118 +4709,11 @@
           <w14:ligatures w14:val="none"/>
         </w:rPr>
       </w:r>
-    </w:p>
-    <w:p>
-      <w:pPr>
-        <w:pStyle w:val="855"/>
-        <w:pBdr/>
-        <w:spacing/>
-        <w:ind/>
-        <w:rPr>
-          <w14:ligatures w14:val="none"/>
-        </w:rPr>
-      </w:pPr>
-      <w:r>
-        <w:t xml:space="preserve">Hacer una clase de utilidad que reciba rutas y devuelva errores específicos </w:t>
-      </w:r>
-      <w:r>
-        <w:t xml:space="preserve">personalizados.</w:t>
-      </w:r>
       <w:r>
         <w:rPr>
           <w14:ligatures w14:val="none"/>
         </w:rPr>
       </w:r>
-    </w:p>
-    <w:p>
-      <w:pPr>
-        <w:pStyle w:val="855"/>
-        <w:pBdr/>
-        <w:spacing/>
-        <w:ind/>
-        <w:rPr>
-          <w14:ligatures w14:val="none"/>
-        </w:rPr>
-      </w:pPr>
-      <w:r>
-        <w:t xml:space="preserve">Comprobar si el fichero está en uso (bloqueado) y manejar la excepción.</w:t>
-      </w:r>
-      <w:r>
-        <w:rPr>
-          <w14:ligatures w14:val="none"/>
-        </w:rPr>
-      </w:r>
-    </w:p>
-    <w:p>
-      <w:pPr>
-        <w:pStyle w:val="855"/>
-        <w:pBdr/>
-        <w:spacing/>
-        <w:ind/>
-        <w:rPr>
-          <w14:ligatures w14:val="none"/>
-        </w:rPr>
-      </w:pPr>
-      <w:r>
-        <w:t xml:space="preserve">Implementar un logger que guarde todas las excepciones en un fichero errores.log.</w:t>
-      </w:r>
-      <w:r>
-        <w:rPr>
-          <w14:ligatures w14:val="none"/>
-        </w:rPr>
-      </w:r>
-    </w:p>
-    <w:p>
-      <w:pPr>
-        <w:pStyle w:val="855"/>
-        <w:pBdr/>
-        <w:spacing/>
-        <w:ind/>
-        <w:rPr>
-          <w14:ligatures w14:val="none"/>
-        </w:rPr>
-      </w:pPr>
-      <w:r>
-        <w:t xml:space="preserve">Crear un validador que antes de leer un fichero, compruebe su existencia y permisos.</w:t>
-      </w:r>
-      <w:r>
-        <w:rPr>
-          <w14:ligatures w14:val="none"/>
-        </w:rPr>
-      </w:r>
-    </w:p>
-    <w:p>
-      <w:pPr>
-        <w:pStyle w:val="855"/>
-        <w:pBdr/>
-        <w:spacing/>
-        <w:ind/>
-        <w:rPr>
-          <w14:ligatures w14:val="none"/>
-        </w:rPr>
-      </w:pPr>
-      <w:r>
-        <w:t xml:space="preserve">Realizar operaciones de escritura concurrente en un fichero y capturar posibles </w:t>
-      </w:r>
-      <w:r>
-        <w:t xml:space="preserve">errores.</w:t>
-      </w:r>
-      <w:r>
-        <w:rPr>
-          <w14:ligatures w14:val="none"/>
-        </w:rPr>
-      </w:r>
-    </w:p>
-    <w:p>
-      <w:pPr>
-        <w:pBdr/>
-        <w:shd w:val="nil" w:color="auto"/>
-        <w:spacing/>
-        <w:ind/>
-        <w:rPr>
-          <w14:ligatures w14:val="none"/>
-        </w:rPr>
-      </w:pPr>
       <w:r>
         <w:rPr>
           <w:highlight w:val="none"/>
@@ -5305,7 +4722,12 @@
       </w:r>
       <w:r>
         <w:rPr>
-          <w:highlight w:val="none"/>
+          <w14:ligatures w14:val="none"/>
+        </w:rPr>
+      </w:r>
+      <w:r>
+        <w:rPr>
+          <w14:ligatures w14:val="none"/>
         </w:rPr>
       </w:r>
       <w:r>
@@ -5340,7 +4762,12 @@
         <w:t xml:space="preserve">desarrolladas</w:t>
       </w:r>
       <w:bookmarkEnd w:id="7"/>
-      <w:r/>
+      <w:r>
+        <w:rPr>
+          <w:highlight w:val="none"/>
+          <w14:ligatures w14:val="none"/>
+        </w:rPr>
+      </w:r>
       <w:r>
         <w:rPr>
           <w:highlight w:val="none"/>
@@ -5369,23 +4796,6 @@
           <w14:ligatures w14:val="none"/>
         </w:rPr>
       </w:r>
-    </w:p>
-    <w:p>
-      <w:pPr>
-        <w:pStyle w:val="855"/>
-        <w:pBdr/>
-        <w:spacing/>
-        <w:ind/>
-        <w:rPr>
-          <w14:ligatures w14:val="none"/>
-        </w:rPr>
-      </w:pPr>
-      <w:r>
-        <w:t xml:space="preserve">Simular una batería de pruebas manuales: introducir errores de entrada y comprobar </w:t>
-      </w:r>
-      <w:r>
-        <w:t xml:space="preserve">respuestas.</w:t>
-      </w:r>
       <w:r>
         <w:rPr>
           <w14:ligatures w14:val="none"/>
@@ -5403,155 +4813,12 @@
         </w:rPr>
       </w:pPr>
       <w:r>
-        <w:t xml:space="preserve">Escribir un README (en texto plano o Markdown) que explique cómo ejecutar y </w:t>
-      </w:r>
-      <w:r>
-        <w:t xml:space="preserve">probar la aplicación.</w:t>
-      </w:r>
-      <w:r>
-        <w:rPr>
-          <w14:ligatures w14:val="none"/>
-        </w:rPr>
-      </w:r>
-    </w:p>
-    <w:p>
-      <w:pPr>
-        <w:pStyle w:val="855"/>
-        <w:pBdr/>
-        <w:spacing/>
-        <w:ind/>
-        <w:rPr>
-          <w14:ligatures w14:val="none"/>
-        </w:rPr>
-      </w:pPr>
-      <w:r>
-        <w:t xml:space="preserve">Documentar el proceso de conversión de ficheros con pasos y resultados esperados.</w:t>
-      </w:r>
-      <w:r>
-        <w:rPr>
-          <w14:ligatures w14:val="none"/>
-        </w:rPr>
-      </w:r>
-    </w:p>
-    <w:p>
-      <w:pPr>
-        <w:pStyle w:val="855"/>
-        <w:pBdr/>
-        <w:spacing/>
-        <w:ind/>
-        <w:rPr>
-          <w14:ligatures w14:val="none"/>
-        </w:rPr>
-      </w:pPr>
-      <w:r>
-        <w:t xml:space="preserve">Escribir métodos testX() dentro de una clase de pruebas con diferentes escenarios de </w:t>
-      </w:r>
-      <w:r>
-        <w:t xml:space="preserve">ficheros.</w:t>
-      </w:r>
-      <w:r>
-        <w:rPr>
-          <w14:ligatures w14:val="none"/>
-        </w:rPr>
-      </w:r>
-    </w:p>
-    <w:p>
-      <w:pPr>
-        <w:pStyle w:val="855"/>
-        <w:pBdr/>
-        <w:spacing/>
-        <w:ind/>
-        <w:rPr>
-          <w14:ligatures w14:val="none"/>
-        </w:rPr>
-      </w:pPr>
-      <w:r>
         <w:t xml:space="preserve">Probar qué ocurre al leer un fichero vacío y documentar el comportamiento esperado.</w:t>
       </w:r>
       <w:r>
         <w:rPr>
           <w14:ligatures w14:val="none"/>
         </w:rPr>
-      </w:r>
-    </w:p>
-    <w:p>
-      <w:pPr>
-        <w:pStyle w:val="855"/>
-        <w:pBdr/>
-        <w:spacing/>
-        <w:ind/>
-        <w:rPr>
-          <w14:ligatures w14:val="none"/>
-        </w:rPr>
-      </w:pPr>
-      <w:r>
-        <w:t xml:space="preserve">Realizar pruebas de rendimiento en lectura secuencial vs aleatoria y documentar los </w:t>
-      </w:r>
-      <w:r>
-        <w:t xml:space="preserve">resultados.</w:t>
-      </w:r>
-      <w:r>
-        <w:rPr>
-          <w14:ligatures w14:val="none"/>
-        </w:rPr>
-      </w:r>
-    </w:p>
-    <w:p>
-      <w:pPr>
-        <w:pStyle w:val="855"/>
-        <w:pBdr/>
-        <w:spacing/>
-        <w:ind/>
-        <w:rPr>
-          <w14:ligatures w14:val="none"/>
-        </w:rPr>
-      </w:pPr>
-      <w:r>
-        <w:t xml:space="preserve">Generar logs de cada operación realizada y analizar si las salidas son coherentes.</w:t>
-      </w:r>
-      <w:r>
-        <w:rPr>
-          <w14:ligatures w14:val="none"/>
-        </w:rPr>
-      </w:r>
-    </w:p>
-    <w:p>
-      <w:pPr>
-        <w:pStyle w:val="855"/>
-        <w:pBdr/>
-        <w:spacing/>
-        <w:ind/>
-        <w:rPr>
-          <w14:ligatures w14:val="none"/>
-        </w:rPr>
-      </w:pPr>
-      <w:r>
-        <w:t xml:space="preserve">Añadir mensajes de depuración en todos los métodos de gestión de ficheros y revisar el </w:t>
-      </w:r>
-      <w:r>
-        <w:t xml:space="preserve">flujo.</w:t>
-      </w:r>
-      <w:r>
-        <w:rPr>
-          <w14:ligatures w14:val="none"/>
-        </w:rPr>
-      </w:r>
-    </w:p>
-    <w:p>
-      <w:pPr>
-        <w:pStyle w:val="855"/>
-        <w:pBdr/>
-        <w:spacing/>
-        <w:ind/>
-        <w:rPr>
-          <w14:ligatures w14:val="none"/>
-        </w:rPr>
-      </w:pPr>
-      <w:r>
-        <w:t xml:space="preserve">Aplicar assert en diferentes puntos del código para verificar estados intermedios </w:t>
-      </w:r>
-      <w:r>
-        <w:t xml:space="preserve">y documentar los casos.</w:t>
       </w:r>
       <w:r>
         <w:rPr>
@@ -36535,7 +35802,6 @@
         <w:ind/>
         <w:rPr/>
       </w:pPr>
-      <w:r/>
       <w:r>
         <w:separator/>
       </w:r>
@@ -36550,7 +35816,6 @@
         <w:ind/>
         <w:rPr/>
       </w:pPr>
-      <w:r/>
       <w:r>
         <w:continuationSeparator/>
       </w:r>
@@ -36587,7 +35852,6 @@
         <w:ind/>
         <w:rPr/>
       </w:pPr>
-      <w:r/>
       <w:r>
         <w:separator/>
       </w:r>
@@ -36602,7 +35866,6 @@
         <w:ind/>
         <w:rPr/>
       </w:pPr>
-      <w:r/>
       <w:r>
         <w:continuationSeparator/>
       </w:r>
@@ -36798,7 +36061,7 @@
     <w:lsdException w:name="Bibliography" w:uiPriority="37"/>
     <w:lsdException w:name="TOC Heading" w:uiPriority="39" w:qFormat="1"/>
   </w:latentStyles>
-  <w:style w:type="table" w:styleId="1380" w:default="1">
+  <w:style w:type="table" w:styleId="1416" w:default="1">
     <w:name w:val="Normal Table"/>
     <w:uiPriority w:val="99"/>
     <w:semiHidden/>
@@ -36991,9 +36254,9 @@
       </w:tcPr>
     </w:tblStylePr>
   </w:style>
-  <w:style w:type="table" w:styleId="1381">
+  <w:style w:type="table" w:styleId="1417">
     <w:name w:val="Table Grid"/>
-    <w:basedOn w:val="1380"/>
+    <w:basedOn w:val="1416"/>
     <w:uiPriority w:val="59"/>
     <w:pPr>
       <w:pBdr/>
@@ -37190,9 +36453,9 @@
       </w:tcPr>
     </w:tblStylePr>
   </w:style>
-  <w:style w:type="table" w:styleId="1382">
+  <w:style w:type="table" w:styleId="1418">
     <w:name w:val="Table Grid Light"/>
-    <w:basedOn w:val="1380"/>
+    <w:basedOn w:val="1416"/>
     <w:uiPriority w:val="59"/>
     <w:pPr>
       <w:pBdr/>
@@ -37389,9 +36652,9 @@
       </w:tcPr>
     </w:tblStylePr>
   </w:style>
-  <w:style w:type="table" w:styleId="1383">
+  <w:style w:type="table" w:styleId="1419">
     <w:name w:val="Plain Table 1"/>
-    <w:basedOn w:val="1380"/>
+    <w:basedOn w:val="1416"/>
     <w:uiPriority w:val="59"/>
     <w:pPr>
       <w:pBdr/>
@@ -37614,9 +36877,9 @@
       </w:tcPr>
     </w:tblStylePr>
   </w:style>
-  <w:style w:type="table" w:styleId="1384">
+  <w:style w:type="table" w:styleId="1420">
     <w:name w:val="Plain Table 2"/>
-    <w:basedOn w:val="1380"/>
+    <w:basedOn w:val="1416"/>
     <w:uiPriority w:val="59"/>
     <w:pPr>
       <w:pBdr/>
@@ -37847,9 +37110,9 @@
       </w:tcPr>
     </w:tblStylePr>
   </w:style>
-  <w:style w:type="table" w:styleId="1385">
+  <w:style w:type="table" w:styleId="1421">
     <w:name w:val="Plain Table 3"/>
-    <w:basedOn w:val="1380"/>
+    <w:basedOn w:val="1416"/>
     <w:uiPriority w:val="99"/>
     <w:pPr>
       <w:pBdr/>
@@ -38077,9 +37340,9 @@
       </w:tcPr>
     </w:tblStylePr>
   </w:style>
-  <w:style w:type="table" w:styleId="1386">
+  <w:style w:type="table" w:styleId="1422">
     <w:name w:val="Plain Table 4"/>
-    <w:basedOn w:val="1380"/>
+    <w:basedOn w:val="1416"/>
     <w:uiPriority w:val="99"/>
     <w:pPr>
       <w:pBdr/>
@@ -38293,9 +37556,9 @@
       </w:tcPr>
     </w:tblStylePr>
   </w:style>
-  <w:style w:type="table" w:styleId="1387">
+  <w:style w:type="table" w:styleId="1423">
     <w:name w:val="Plain Table 5"/>
-    <w:basedOn w:val="1380"/>
+    <w:basedOn w:val="1416"/>
     <w:uiPriority w:val="99"/>
     <w:pPr>
       <w:pBdr/>
@@ -38526,9 +37789,9 @@
       </w:tcPr>
     </w:tblStylePr>
   </w:style>
-  <w:style w:type="table" w:styleId="1388">
+  <w:style w:type="table" w:styleId="1424">
     <w:name w:val="Grid Table 1 Light"/>
-    <w:basedOn w:val="1380"/>
+    <w:basedOn w:val="1416"/>
     <w:uiPriority w:val="99"/>
     <w:pPr>
       <w:pBdr/>
@@ -38749,9 +38012,9 @@
       </w:tcPr>
     </w:tblStylePr>
   </w:style>
-  <w:style w:type="table" w:styleId="1389">
+  <w:style w:type="table" w:styleId="1425">
     <w:name w:val="Grid Table 1 Light - Accent 1"/>
-    <w:basedOn w:val="1380"/>
+    <w:basedOn w:val="1416"/>
     <w:uiPriority w:val="99"/>
     <w:pPr>
       <w:pBdr/>
@@ -38972,9 +38235,9 @@
       </w:tcPr>
     </w:tblStylePr>
   </w:style>
-  <w:style w:type="table" w:styleId="1390">
+  <w:style w:type="table" w:styleId="1426">
     <w:name w:val="Grid Table 1 Light - Accent 2"/>
-    <w:basedOn w:val="1380"/>
+    <w:basedOn w:val="1416"/>
     <w:uiPriority w:val="99"/>
     <w:pPr>
       <w:pBdr/>
@@ -39195,9 +38458,9 @@
       </w:tcPr>
     </w:tblStylePr>
   </w:style>
-  <w:style w:type="table" w:styleId="1391">
+  <w:style w:type="table" w:styleId="1427">
     <w:name w:val="Grid Table 1 Light - Accent 3"/>
-    <w:basedOn w:val="1380"/>
+    <w:basedOn w:val="1416"/>
     <w:uiPriority w:val="99"/>
     <w:pPr>
       <w:pBdr/>
@@ -39418,9 +38681,9 @@
       </w:tcPr>
     </w:tblStylePr>
   </w:style>
-  <w:style w:type="table" w:styleId="1392">
+  <w:style w:type="table" w:styleId="1428">
     <w:name w:val="Grid Table 1 Light - Accent 4"/>
-    <w:basedOn w:val="1380"/>
+    <w:basedOn w:val="1416"/>
     <w:uiPriority w:val="99"/>
     <w:pPr>
       <w:pBdr/>
@@ -39641,9 +38904,9 @@
       </w:tcPr>
     </w:tblStylePr>
   </w:style>
-  <w:style w:type="table" w:styleId="1393">
+  <w:style w:type="table" w:styleId="1429">
     <w:name w:val="Grid Table 1 Light - Accent 5"/>
-    <w:basedOn w:val="1380"/>
+    <w:basedOn w:val="1416"/>
     <w:uiPriority w:val="99"/>
     <w:pPr>
       <w:pBdr/>
@@ -39864,9 +39127,9 @@
       </w:tcPr>
     </w:tblStylePr>
   </w:style>
-  <w:style w:type="table" w:styleId="1394">
+  <w:style w:type="table" w:styleId="1430">
     <w:name w:val="Grid Table 1 Light - Accent 6"/>
-    <w:basedOn w:val="1380"/>
+    <w:basedOn w:val="1416"/>
     <w:uiPriority w:val="99"/>
     <w:pPr>
       <w:pBdr/>
@@ -40087,9 +39350,9 @@
       </w:tcPr>
     </w:tblStylePr>
   </w:style>
-  <w:style w:type="table" w:styleId="1395">
+  <w:style w:type="table" w:styleId="1431">
     <w:name w:val="Grid Table 2"/>
-    <w:basedOn w:val="1380"/>
+    <w:basedOn w:val="1416"/>
     <w:uiPriority w:val="99"/>
     <w:pPr>
       <w:pBdr/>
@@ -40319,9 +39582,9 @@
       </w:tcPr>
     </w:tblStylePr>
   </w:style>
-  <w:style w:type="table" w:styleId="1396">
+  <w:style w:type="table" w:styleId="1432">
     <w:name w:val="Grid Table 2 - Accent 1"/>
-    <w:basedOn w:val="1380"/>
+    <w:basedOn w:val="1416"/>
     <w:uiPriority w:val="99"/>
     <w:pPr>
       <w:pBdr/>
@@ -40551,9 +39814,9 @@
       </w:tcPr>
     </w:tblStylePr>
   </w:style>
-  <w:style w:type="table" w:styleId="1397">
+  <w:style w:type="table" w:styleId="1433">
     <w:name w:val="Grid Table 2 - Accent 2"/>
-    <w:basedOn w:val="1380"/>
+    <w:basedOn w:val="1416"/>
     <w:uiPriority w:val="99"/>
     <w:pPr>
       <w:pBdr/>
@@ -40783,9 +40046,9 @@
       </w:tcPr>
     </w:tblStylePr>
   </w:style>
-  <w:style w:type="table" w:styleId="1398">
+  <w:style w:type="table" w:styleId="1434">
     <w:name w:val="Grid Table 2 - Accent 3"/>
-    <w:basedOn w:val="1380"/>
+    <w:basedOn w:val="1416"/>
     <w:uiPriority w:val="99"/>
     <w:pPr>
       <w:pBdr/>
@@ -41015,9 +40278,9 @@
       </w:tcPr>
     </w:tblStylePr>
   </w:style>
-  <w:style w:type="table" w:styleId="1399">
+  <w:style w:type="table" w:styleId="1435">
     <w:name w:val="Grid Table 2 - Accent 4"/>
-    <w:basedOn w:val="1380"/>
+    <w:basedOn w:val="1416"/>
     <w:uiPriority w:val="99"/>
     <w:pPr>
       <w:pBdr/>
@@ -41247,9 +40510,9 @@
       </w:tcPr>
     </w:tblStylePr>
   </w:style>
-  <w:style w:type="table" w:styleId="1400">
+  <w:style w:type="table" w:styleId="1436">
     <w:name w:val="Grid Table 2 - Accent 5"/>
-    <w:basedOn w:val="1380"/>
+    <w:basedOn w:val="1416"/>
     <w:uiPriority w:val="99"/>
     <w:pPr>
       <w:pBdr/>
@@ -41479,9 +40742,9 @@
       </w:tcPr>
     </w:tblStylePr>
   </w:style>
-  <w:style w:type="table" w:styleId="1401">
+  <w:style w:type="table" w:styleId="1437">
     <w:name w:val="Grid Table 2 - Accent 6"/>
-    <w:basedOn w:val="1380"/>
+    <w:basedOn w:val="1416"/>
     <w:uiPriority w:val="99"/>
     <w:pPr>
       <w:pBdr/>
@@ -41711,9 +40974,9 @@
       </w:tcPr>
     </w:tblStylePr>
   </w:style>
-  <w:style w:type="table" w:styleId="1402">
+  <w:style w:type="table" w:styleId="1438">
     <w:name w:val="Grid Table 3"/>
-    <w:basedOn w:val="1380"/>
+    <w:basedOn w:val="1416"/>
     <w:uiPriority w:val="99"/>
     <w:pPr>
       <w:pBdr/>
@@ -41956,9 +41219,9 @@
       </w:tcPr>
     </w:tblStylePr>
   </w:style>
-  <w:style w:type="table" w:styleId="1403">
+  <w:style w:type="table" w:styleId="1439">
     <w:name w:val="Grid Table 3 - Accent 1"/>
-    <w:basedOn w:val="1380"/>
+    <w:basedOn w:val="1416"/>
     <w:uiPriority w:val="99"/>
     <w:pPr>
       <w:pBdr/>
@@ -42201,9 +41464,9 @@
       </w:tcPr>
     </w:tblStylePr>
   </w:style>
-  <w:style w:type="table" w:styleId="1404">
+  <w:style w:type="table" w:styleId="1440">
     <w:name w:val="Grid Table 3 - Accent 2"/>
-    <w:basedOn w:val="1380"/>
+    <w:basedOn w:val="1416"/>
     <w:uiPriority w:val="99"/>
     <w:pPr>
       <w:pBdr/>
@@ -42446,9 +41709,9 @@
       </w:tcPr>
     </w:tblStylePr>
   </w:style>
-  <w:style w:type="table" w:styleId="1405">
+  <w:style w:type="table" w:styleId="1441">
     <w:name w:val="Grid Table 3 - Accent 3"/>
-    <w:basedOn w:val="1380"/>
+    <w:basedOn w:val="1416"/>
     <w:uiPriority w:val="99"/>
     <w:pPr>
       <w:pBdr/>
@@ -42691,9 +41954,9 @@
       </w:tcPr>
     </w:tblStylePr>
   </w:style>
-  <w:style w:type="table" w:styleId="1406">
+  <w:style w:type="table" w:styleId="1442">
     <w:name w:val="Grid Table 3 - Accent 4"/>
-    <w:basedOn w:val="1380"/>
+    <w:basedOn w:val="1416"/>
     <w:uiPriority w:val="99"/>
     <w:pPr>
       <w:pBdr/>
@@ -42936,9 +42199,9 @@
       </w:tcPr>
     </w:tblStylePr>
   </w:style>
-  <w:style w:type="table" w:styleId="1407">
+  <w:style w:type="table" w:styleId="1443">
     <w:name w:val="Grid Table 3 - Accent 5"/>
-    <w:basedOn w:val="1380"/>
+    <w:basedOn w:val="1416"/>
     <w:uiPriority w:val="99"/>
     <w:pPr>
       <w:pBdr/>
@@ -43181,9 +42444,9 @@
       </w:tcPr>
     </w:tblStylePr>
   </w:style>
-  <w:style w:type="table" w:styleId="1408">
+  <w:style w:type="table" w:styleId="1444">
     <w:name w:val="Grid Table 3 - Accent 6"/>
-    <w:basedOn w:val="1380"/>
+    <w:basedOn w:val="1416"/>
     <w:uiPriority w:val="99"/>
     <w:pPr>
       <w:pBdr/>
@@ -43426,9 +42689,9 @@
       </w:tcPr>
     </w:tblStylePr>
   </w:style>
-  <w:style w:type="table" w:styleId="1409">
+  <w:style w:type="table" w:styleId="1445">
     <w:name w:val="Grid Table 4"/>
-    <w:basedOn w:val="1380"/>
+    <w:basedOn w:val="1416"/>
     <w:uiPriority w:val="59"/>
     <w:pPr>
       <w:pBdr/>
@@ -43659,9 +42922,9 @@
       </w:tcPr>
     </w:tblStylePr>
   </w:style>
-  <w:style w:type="table" w:styleId="1410">
+  <w:style w:type="table" w:styleId="1446">
     <w:name w:val="Grid Table 4 - Accent 1"/>
-    <w:basedOn w:val="1380"/>
+    <w:basedOn w:val="1416"/>
     <w:uiPriority w:val="59"/>
     <w:pPr>
       <w:pBdr/>
@@ -43892,9 +43155,9 @@
       </w:tcPr>
     </w:tblStylePr>
   </w:style>
-  <w:style w:type="table" w:styleId="1411">
+  <w:style w:type="table" w:styleId="1447">
     <w:name w:val="Grid Table 4 - Accent 2"/>
-    <w:basedOn w:val="1380"/>
+    <w:basedOn w:val="1416"/>
     <w:uiPriority w:val="59"/>
     <w:pPr>
       <w:pBdr/>
@@ -44125,9 +43388,9 @@
       </w:tcPr>
     </w:tblStylePr>
   </w:style>
-  <w:style w:type="table" w:styleId="1412">
+  <w:style w:type="table" w:styleId="1448">
     <w:name w:val="Grid Table 4 - Accent 3"/>
-    <w:basedOn w:val="1380"/>
+    <w:basedOn w:val="1416"/>
     <w:uiPriority w:val="59"/>
     <w:pPr>
       <w:pBdr/>
@@ -44358,9 +43621,9 @@
       </w:tcPr>
     </w:tblStylePr>
   </w:style>
-  <w:style w:type="table" w:styleId="1413">
+  <w:style w:type="table" w:styleId="1449">
     <w:name w:val="Grid Table 4 - Accent 4"/>
-    <w:basedOn w:val="1380"/>
+    <w:basedOn w:val="1416"/>
     <w:uiPriority w:val="59"/>
     <w:pPr>
       <w:pBdr/>
@@ -44591,9 +43854,9 @@
       </w:tcPr>
     </w:tblStylePr>
   </w:style>
-  <w:style w:type="table" w:styleId="1414">
+  <w:style w:type="table" w:styleId="1450">
     <w:name w:val="Grid Table 4 - Accent 5"/>
-    <w:basedOn w:val="1380"/>
+    <w:basedOn w:val="1416"/>
     <w:uiPriority w:val="59"/>
     <w:pPr>
       <w:pBdr/>
@@ -44824,9 +44087,9 @@
       </w:tcPr>
     </w:tblStylePr>
   </w:style>
-  <w:style w:type="table" w:styleId="1415">
+  <w:style w:type="table" w:styleId="1451">
     <w:name w:val="Grid Table 4 - Accent 6"/>
-    <w:basedOn w:val="1380"/>
+    <w:basedOn w:val="1416"/>
     <w:uiPriority w:val="59"/>
     <w:pPr>
       <w:pBdr/>
@@ -45057,9 +44320,9 @@
       </w:tcPr>
     </w:tblStylePr>
   </w:style>
-  <w:style w:type="table" w:styleId="1416">
+  <w:style w:type="table" w:styleId="1452">
     <w:name w:val="Grid Table 5 Dark"/>
-    <w:basedOn w:val="1380"/>
+    <w:basedOn w:val="1416"/>
     <w:uiPriority w:val="99"/>
     <w:pPr>
       <w:pBdr/>
@@ -45285,9 +44548,9 @@
       </w:tcPr>
     </w:tblStylePr>
   </w:style>
-  <w:style w:type="table" w:styleId="1417">
+  <w:style w:type="table" w:styleId="1453">
     <w:name w:val="Grid Table 5 Dark- Accent 1"/>
-    <w:basedOn w:val="1380"/>
+    <w:basedOn w:val="1416"/>
     <w:uiPriority w:val="99"/>
     <w:pPr>
       <w:pBdr/>
@@ -45513,9 +44776,9 @@
       </w:tcPr>
     </w:tblStylePr>
   </w:style>
-  <w:style w:type="table" w:styleId="1418">
+  <w:style w:type="table" w:styleId="1454">
     <w:name w:val="Grid Table 5 Dark - Accent 2"/>
-    <w:basedOn w:val="1380"/>
+    <w:basedOn w:val="1416"/>
     <w:uiPriority w:val="99"/>
     <w:pPr>
       <w:pBdr/>
@@ -45741,9 +45004,9 @@
       </w:tcPr>
     </w:tblStylePr>
   </w:style>
-  <w:style w:type="table" w:styleId="1419">
+  <w:style w:type="table" w:styleId="1455">
     <w:name w:val="Grid Table 5 Dark - Accent 3"/>
-    <w:basedOn w:val="1380"/>
+    <w:basedOn w:val="1416"/>
     <w:uiPriority w:val="99"/>
     <w:pPr>
       <w:pBdr/>
@@ -45969,9 +45232,9 @@
       </w:tcPr>
     </w:tblStylePr>
   </w:style>
-  <w:style w:type="table" w:styleId="1420">
+  <w:style w:type="table" w:styleId="1456">
     <w:name w:val="Grid Table 5 Dark- Accent 4"/>
-    <w:basedOn w:val="1380"/>
+    <w:basedOn w:val="1416"/>
     <w:uiPriority w:val="99"/>
     <w:pPr>
       <w:pBdr/>
@@ -46197,9 +45460,9 @@
       </w:tcPr>
     </w:tblStylePr>
   </w:style>
-  <w:style w:type="table" w:styleId="1421">
+  <w:style w:type="table" w:styleId="1457">
     <w:name w:val="Grid Table 5 Dark - Accent 5"/>
-    <w:basedOn w:val="1380"/>
+    <w:basedOn w:val="1416"/>
     <w:uiPriority w:val="99"/>
     <w:pPr>
       <w:pBdr/>
@@ -46425,9 +45688,9 @@
       </w:tcPr>
     </w:tblStylePr>
   </w:style>
-  <w:style w:type="table" w:styleId="1422">
+  <w:style w:type="table" w:styleId="1458">
     <w:name w:val="Grid Table 5 Dark - Accent 6"/>
-    <w:basedOn w:val="1380"/>
+    <w:basedOn w:val="1416"/>
     <w:uiPriority w:val="99"/>
     <w:pPr>
       <w:pBdr/>
@@ -46653,9 +45916,9 @@
       </w:tcPr>
     </w:tblStylePr>
   </w:style>
-  <w:style w:type="table" w:styleId="1423">
+  <w:style w:type="table" w:styleId="1459">
     <w:name w:val="Grid Table 6 Colorful"/>
-    <w:basedOn w:val="1380"/>
+    <w:basedOn w:val="1416"/>
     <w:uiPriority w:val="99"/>
     <w:pPr>
       <w:pBdr/>
@@ -46883,9 +46146,9 @@
       </w:tcPr>
     </w:tblStylePr>
   </w:style>
-  <w:style w:type="table" w:styleId="1424">
+  <w:style w:type="table" w:styleId="1460">
     <w:name w:val="Grid Table 6 Colorful - Accent 1"/>
-    <w:basedOn w:val="1380"/>
+    <w:basedOn w:val="1416"/>
     <w:uiPriority w:val="99"/>
     <w:pPr>
       <w:pBdr/>
@@ -47113,9 +46376,9 @@
       </w:tcPr>
     </w:tblStylePr>
   </w:style>
-  <w:style w:type="table" w:styleId="1425">
+  <w:style w:type="table" w:styleId="1461">
     <w:name w:val="Grid Table 6 Colorful - Accent 2"/>
-    <w:basedOn w:val="1380"/>
+    <w:basedOn w:val="1416"/>
     <w:uiPriority w:val="99"/>
     <w:pPr>
       <w:pBdr/>
@@ -47343,9 +46606,9 @@
       </w:tcPr>
     </w:tblStylePr>
   </w:style>
-  <w:style w:type="table" w:styleId="1426">
+  <w:style w:type="table" w:styleId="1462">
     <w:name w:val="Grid Table 6 Colorful - Accent 3"/>
-    <w:basedOn w:val="1380"/>
+    <w:basedOn w:val="1416"/>
     <w:uiPriority w:val="99"/>
     <w:pPr>
       <w:pBdr/>
@@ -47573,9 +46836,9 @@
       </w:tcPr>
     </w:tblStylePr>
   </w:style>
-  <w:style w:type="table" w:styleId="1427">
+  <w:style w:type="table" w:styleId="1463">
     <w:name w:val="Grid Table 6 Colorful - Accent 4"/>
-    <w:basedOn w:val="1380"/>
+    <w:basedOn w:val="1416"/>
     <w:uiPriority w:val="99"/>
     <w:pPr>
       <w:pBdr/>
@@ -47803,9 +47066,9 @@
       </w:tcPr>
     </w:tblStylePr>
   </w:style>
-  <w:style w:type="table" w:styleId="1428">
+  <w:style w:type="table" w:styleId="1464">
     <w:name w:val="Grid Table 6 Colorful - Accent 5"/>
-    <w:basedOn w:val="1380"/>
+    <w:basedOn w:val="1416"/>
     <w:uiPriority w:val="99"/>
     <w:pPr>
       <w:pBdr/>
@@ -48033,9 +47296,9 @@
       </w:tcPr>
     </w:tblStylePr>
   </w:style>
-  <w:style w:type="table" w:styleId="1429">
+  <w:style w:type="table" w:styleId="1465">
     <w:name w:val="Grid Table 6 Colorful - Accent 6"/>
-    <w:basedOn w:val="1380"/>
+    <w:basedOn w:val="1416"/>
     <w:uiPriority w:val="99"/>
     <w:pPr>
       <w:pBdr/>
@@ -48263,9 +47526,9 @@
       </w:tcPr>
     </w:tblStylePr>
   </w:style>
-  <w:style w:type="table" w:styleId="1430">
+  <w:style w:type="table" w:styleId="1466">
     <w:name w:val="Grid Table 7 Colorful"/>
-    <w:basedOn w:val="1380"/>
+    <w:basedOn w:val="1416"/>
     <w:uiPriority w:val="99"/>
     <w:pPr>
       <w:pBdr/>
@@ -48517,9 +47780,9 @@
       </w:tcPr>
     </w:tblStylePr>
   </w:style>
-  <w:style w:type="table" w:styleId="1431">
+  <w:style w:type="table" w:styleId="1467">
     <w:name w:val="Grid Table 7 Colorful - Accent 1"/>
-    <w:basedOn w:val="1380"/>
+    <w:basedOn w:val="1416"/>
     <w:uiPriority w:val="99"/>
     <w:pPr>
       <w:pBdr/>
@@ -48771,9 +48034,9 @@
       </w:tcPr>
     </w:tblStylePr>
   </w:style>
-  <w:style w:type="table" w:styleId="1432">
+  <w:style w:type="table" w:styleId="1468">
     <w:name w:val="Grid Table 7 Colorful - Accent 2"/>
-    <w:basedOn w:val="1380"/>
+    <w:basedOn w:val="1416"/>
     <w:uiPriority w:val="99"/>
     <w:pPr>
       <w:pBdr/>
@@ -49025,9 +48288,9 @@
       </w:tcPr>
     </w:tblStylePr>
   </w:style>
-  <w:style w:type="table" w:styleId="1433">
+  <w:style w:type="table" w:styleId="1469">
     <w:name w:val="Grid Table 7 Colorful - Accent 3"/>
-    <w:basedOn w:val="1380"/>
+    <w:basedOn w:val="1416"/>
     <w:uiPriority w:val="99"/>
     <w:pPr>
       <w:pBdr/>
@@ -49279,9 +48542,9 @@
       </w:tcPr>
     </w:tblStylePr>
   </w:style>
-  <w:style w:type="table" w:styleId="1434">
+  <w:style w:type="table" w:styleId="1470">
     <w:name w:val="Grid Table 7 Colorful - Accent 4"/>
-    <w:basedOn w:val="1380"/>
+    <w:basedOn w:val="1416"/>
     <w:uiPriority w:val="99"/>
     <w:pPr>
       <w:pBdr/>
@@ -49533,9 +48796,9 @@
       </w:tcPr>
     </w:tblStylePr>
   </w:style>
-  <w:style w:type="table" w:styleId="1435">
+  <w:style w:type="table" w:styleId="1471">
     <w:name w:val="Grid Table 7 Colorful - Accent 5"/>
-    <w:basedOn w:val="1380"/>
+    <w:basedOn w:val="1416"/>
     <w:uiPriority w:val="99"/>
     <w:pPr>
       <w:pBdr/>
@@ -49787,9 +49050,9 @@
       </w:tcPr>
     </w:tblStylePr>
   </w:style>
-  <w:style w:type="table" w:styleId="1436">
+  <w:style w:type="table" w:styleId="1472">
     <w:name w:val="Grid Table 7 Colorful - Accent 6"/>
-    <w:basedOn w:val="1380"/>
+    <w:basedOn w:val="1416"/>
     <w:uiPriority w:val="99"/>
     <w:pPr>
       <w:pBdr/>
@@ -50041,9 +49304,9 @@
       </w:tcPr>
     </w:tblStylePr>
   </w:style>
-  <w:style w:type="table" w:styleId="1437">
+  <w:style w:type="table" w:styleId="1473">
     <w:name w:val="List Table 1 Light"/>
-    <w:basedOn w:val="1380"/>
+    <w:basedOn w:val="1416"/>
     <w:uiPriority w:val="99"/>
     <w:pPr>
       <w:pBdr/>
@@ -50257,9 +49520,9 @@
       </w:tcPr>
     </w:tblStylePr>
   </w:style>
-  <w:style w:type="table" w:styleId="1438">
+  <w:style w:type="table" w:styleId="1474">
     <w:name w:val="List Table 1 Light - Accent 1"/>
-    <w:basedOn w:val="1380"/>
+    <w:basedOn w:val="1416"/>
     <w:uiPriority w:val="99"/>
     <w:pPr>
       <w:pBdr/>
@@ -50473,9 +49736,9 @@
       </w:tcPr>
     </w:tblStylePr>
   </w:style>
-  <w:style w:type="table" w:styleId="1439">
+  <w:style w:type="table" w:styleId="1475">
     <w:name w:val="List Table 1 Light - Accent 2"/>
-    <w:basedOn w:val="1380"/>
+    <w:basedOn w:val="1416"/>
     <w:uiPriority w:val="99"/>
     <w:pPr>
       <w:pBdr/>
@@ -50689,9 +49952,9 @@
       </w:tcPr>
     </w:tblStylePr>
   </w:style>
-  <w:style w:type="table" w:styleId="1440">
+  <w:style w:type="table" w:styleId="1476">
     <w:name w:val="List Table 1 Light - Accent 3"/>
-    <w:basedOn w:val="1380"/>
+    <w:basedOn w:val="1416"/>
     <w:uiPriority w:val="99"/>
     <w:pPr>
       <w:pBdr/>
@@ -50905,9 +50168,9 @@
       </w:tcPr>
     </w:tblStylePr>
   </w:style>
-  <w:style w:type="table" w:styleId="1441">
+  <w:style w:type="table" w:styleId="1477">
     <w:name w:val="List Table 1 Light - Accent 4"/>
-    <w:basedOn w:val="1380"/>
+    <w:basedOn w:val="1416"/>
     <w:uiPriority w:val="99"/>
     <w:pPr>
       <w:pBdr/>
@@ -51121,9 +50384,9 @@
       </w:tcPr>
     </w:tblStylePr>
   </w:style>
-  <w:style w:type="table" w:styleId="1442">
+  <w:style w:type="table" w:styleId="1478">
     <w:name w:val="List Table 1 Light - Accent 5"/>
-    <w:basedOn w:val="1380"/>
+    <w:basedOn w:val="1416"/>
     <w:uiPriority w:val="99"/>
     <w:pPr>
       <w:pBdr/>
@@ -51337,9 +50600,9 @@
       </w:tcPr>
     </w:tblStylePr>
   </w:style>
-  <w:style w:type="table" w:styleId="1443">
+  <w:style w:type="table" w:styleId="1479">
     <w:name w:val="List Table 1 Light - Accent 6"/>
-    <w:basedOn w:val="1380"/>
+    <w:basedOn w:val="1416"/>
     <w:uiPriority w:val="99"/>
     <w:pPr>
       <w:pBdr/>
@@ -51553,9 +50816,9 @@
       </w:tcPr>
     </w:tblStylePr>
   </w:style>
-  <w:style w:type="table" w:styleId="1444">
+  <w:style w:type="table" w:styleId="1480">
     <w:name w:val="List Table 2"/>
-    <w:basedOn w:val="1380"/>
+    <w:basedOn w:val="1416"/>
     <w:uiPriority w:val="99"/>
     <w:pPr>
       <w:pBdr/>
@@ -51791,9 +51054,9 @@
       </w:tcPr>
     </w:tblStylePr>
   </w:style>
-  <w:style w:type="table" w:styleId="1445">
+  <w:style w:type="table" w:styleId="1481">
     <w:name w:val="List Table 2 - Accent 1"/>
-    <w:basedOn w:val="1380"/>
+    <w:basedOn w:val="1416"/>
     <w:uiPriority w:val="99"/>
     <w:pPr>
       <w:pBdr/>
@@ -52029,9 +51292,9 @@
       </w:tcPr>
     </w:tblStylePr>
   </w:style>
-  <w:style w:type="table" w:styleId="1446">
+  <w:style w:type="table" w:styleId="1482">
     <w:name w:val="List Table 2 - Accent 2"/>
-    <w:basedOn w:val="1380"/>
+    <w:basedOn w:val="1416"/>
     <w:uiPriority w:val="99"/>
     <w:pPr>
       <w:pBdr/>
@@ -52267,9 +51530,9 @@
       </w:tcPr>
     </w:tblStylePr>
   </w:style>
-  <w:style w:type="table" w:styleId="1447">
+  <w:style w:type="table" w:styleId="1483">
     <w:name w:val="List Table 2 - Accent 3"/>
-    <w:basedOn w:val="1380"/>
+    <w:basedOn w:val="1416"/>
     <w:uiPriority w:val="99"/>
     <w:pPr>
       <w:pBdr/>
@@ -52505,9 +51768,9 @@
       </w:tcPr>
     </w:tblStylePr>
   </w:style>
-  <w:style w:type="table" w:styleId="1448">
+  <w:style w:type="table" w:styleId="1484">
     <w:name w:val="List Table 2 - Accent 4"/>
-    <w:basedOn w:val="1380"/>
+    <w:basedOn w:val="1416"/>
     <w:uiPriority w:val="99"/>
     <w:pPr>
       <w:pBdr/>
@@ -52743,9 +52006,9 @@
       </w:tcPr>
     </w:tblStylePr>
   </w:style>
-  <w:style w:type="table" w:styleId="1449">
+  <w:style w:type="table" w:styleId="1485">
     <w:name w:val="List Table 2 - Accent 5"/>
-    <w:basedOn w:val="1380"/>
+    <w:basedOn w:val="1416"/>
     <w:uiPriority w:val="99"/>
     <w:pPr>
       <w:pBdr/>
@@ -52981,9 +52244,9 @@
       </w:tcPr>
     </w:tblStylePr>
   </w:style>
-  <w:style w:type="table" w:styleId="1450">
+  <w:style w:type="table" w:styleId="1486">
     <w:name w:val="List Table 2 - Accent 6"/>
-    <w:basedOn w:val="1380"/>
+    <w:basedOn w:val="1416"/>
     <w:uiPriority w:val="99"/>
     <w:pPr>
       <w:pBdr/>
@@ -53219,9 +52482,9 @@
       </w:tcPr>
     </w:tblStylePr>
   </w:style>
-  <w:style w:type="table" w:styleId="1451">
+  <w:style w:type="table" w:styleId="1487">
     <w:name w:val="List Table 3"/>
-    <w:basedOn w:val="1380"/>
+    <w:basedOn w:val="1416"/>
     <w:uiPriority w:val="99"/>
     <w:pPr>
       <w:pBdr/>
@@ -53447,9 +52710,9 @@
       </w:tcPr>
     </w:tblStylePr>
   </w:style>
-  <w:style w:type="table" w:styleId="1452">
+  <w:style w:type="table" w:styleId="1488">
     <w:name w:val="List Table 3 - Accent 1"/>
-    <w:basedOn w:val="1380"/>
+    <w:basedOn w:val="1416"/>
     <w:uiPriority w:val="99"/>
     <w:pPr>
       <w:pBdr/>
@@ -53675,9 +52938,9 @@
       </w:tcPr>
     </w:tblStylePr>
   </w:style>
-  <w:style w:type="table" w:styleId="1453">
+  <w:style w:type="table" w:styleId="1489">
     <w:name w:val="List Table 3 - Accent 2"/>
-    <w:basedOn w:val="1380"/>
+    <w:basedOn w:val="1416"/>
     <w:uiPriority w:val="99"/>
     <w:pPr>
       <w:pBdr/>
@@ -53903,9 +53166,9 @@
       </w:tcPr>
     </w:tblStylePr>
   </w:style>
-  <w:style w:type="table" w:styleId="1454">
+  <w:style w:type="table" w:styleId="1490">
     <w:name w:val="List Table 3 - Accent 3"/>
-    <w:basedOn w:val="1380"/>
+    <w:basedOn w:val="1416"/>
     <w:uiPriority w:val="99"/>
     <w:pPr>
       <w:pBdr/>
@@ -54131,9 +53394,9 @@
       </w:tcPr>
     </w:tblStylePr>
   </w:style>
-  <w:style w:type="table" w:styleId="1455">
+  <w:style w:type="table" w:styleId="1491">
     <w:name w:val="List Table 3 - Accent 4"/>
-    <w:basedOn w:val="1380"/>
+    <w:basedOn w:val="1416"/>
     <w:uiPriority w:val="99"/>
     <w:pPr>
       <w:pBdr/>
@@ -54359,9 +53622,9 @@
       </w:tcPr>
     </w:tblStylePr>
   </w:style>
-  <w:style w:type="table" w:styleId="1456">
+  <w:style w:type="table" w:styleId="1492">
     <w:name w:val="List Table 3 - Accent 5"/>
-    <w:basedOn w:val="1380"/>
+    <w:basedOn w:val="1416"/>
     <w:uiPriority w:val="99"/>
     <w:pPr>
       <w:pBdr/>
@@ -54587,9 +53850,9 @@
       </w:tcPr>
     </w:tblStylePr>
   </w:style>
-  <w:style w:type="table" w:styleId="1457">
+  <w:style w:type="table" w:styleId="1493">
     <w:name w:val="List Table 3 - Accent 6"/>
-    <w:basedOn w:val="1380"/>
+    <w:basedOn w:val="1416"/>
     <w:uiPriority w:val="99"/>
     <w:pPr>
       <w:pBdr/>
@@ -54815,9 +54078,9 @@
       </w:tcPr>
     </w:tblStylePr>
   </w:style>
-  <w:style w:type="table" w:styleId="1458">
+  <w:style w:type="table" w:styleId="1494">
     <w:name w:val="List Table 4"/>
-    <w:basedOn w:val="1380"/>
+    <w:basedOn w:val="1416"/>
     <w:uiPriority w:val="99"/>
     <w:pPr>
       <w:pBdr/>
@@ -55040,9 +54303,9 @@
       </w:tcPr>
     </w:tblStylePr>
   </w:style>
-  <w:style w:type="table" w:styleId="1459">
+  <w:style w:type="table" w:styleId="1495">
     <w:name w:val="List Table 4 - Accent 1"/>
-    <w:basedOn w:val="1380"/>
+    <w:basedOn w:val="1416"/>
     <w:uiPriority w:val="99"/>
     <w:pPr>
       <w:pBdr/>
@@ -55265,9 +54528,9 @@
       </w:tcPr>
     </w:tblStylePr>
   </w:style>
-  <w:style w:type="table" w:styleId="1460">
+  <w:style w:type="table" w:styleId="1496">
     <w:name w:val="List Table 4 - Accent 2"/>
-    <w:basedOn w:val="1380"/>
+    <w:basedOn w:val="1416"/>
     <w:uiPriority w:val="99"/>
     <w:pPr>
       <w:pBdr/>
@@ -55490,9 +54753,9 @@
       </w:tcPr>
     </w:tblStylePr>
   </w:style>
-  <w:style w:type="table" w:styleId="1461">
+  <w:style w:type="table" w:styleId="1497">
     <w:name w:val="List Table 4 - Accent 3"/>
-    <w:basedOn w:val="1380"/>
+    <w:basedOn w:val="1416"/>
     <w:uiPriority w:val="99"/>
     <w:pPr>
       <w:pBdr/>
@@ -55715,9 +54978,9 @@
       </w:tcPr>
     </w:tblStylePr>
   </w:style>
-  <w:style w:type="table" w:styleId="1462">
+  <w:style w:type="table" w:styleId="1498">
     <w:name w:val="List Table 4 - Accent 4"/>
-    <w:basedOn w:val="1380"/>
+    <w:basedOn w:val="1416"/>
     <w:uiPriority w:val="99"/>
     <w:pPr>
       <w:pBdr/>
@@ -55940,9 +55203,9 @@
       </w:tcPr>
     </w:tblStylePr>
   </w:style>
-  <w:style w:type="table" w:styleId="1463">
+  <w:style w:type="table" w:styleId="1499">
     <w:name w:val="List Table 4 - Accent 5"/>
-    <w:basedOn w:val="1380"/>
+    <w:basedOn w:val="1416"/>
     <w:uiPriority w:val="99"/>
     <w:pPr>
       <w:pBdr/>
@@ -56165,9 +55428,9 @@
       </w:tcPr>
     </w:tblStylePr>
   </w:style>
-  <w:style w:type="table" w:styleId="1464">
+  <w:style w:type="table" w:styleId="1500">
     <w:name w:val="List Table 4 - Accent 6"/>
-    <w:basedOn w:val="1380"/>
+    <w:basedOn w:val="1416"/>
     <w:uiPriority w:val="99"/>
     <w:pPr>
       <w:pBdr/>
@@ -56390,9 +55653,9 @@
       </w:tcPr>
     </w:tblStylePr>
   </w:style>
-  <w:style w:type="table" w:styleId="1465">
+  <w:style w:type="table" w:styleId="1501">
     <w:name w:val="List Table 5 Dark"/>
-    <w:basedOn w:val="1380"/>
+    <w:basedOn w:val="1416"/>
     <w:uiPriority w:val="99"/>
     <w:pPr>
       <w:pBdr/>
@@ -56632,9 +55895,9 @@
       </w:tcPr>
     </w:tblStylePr>
   </w:style>
-  <w:style w:type="table" w:styleId="1466">
+  <w:style w:type="table" w:styleId="1502">
     <w:name w:val="List Table 5 Dark - Accent 1"/>
-    <w:basedOn w:val="1380"/>
+    <w:basedOn w:val="1416"/>
     <w:uiPriority w:val="99"/>
     <w:pPr>
       <w:pBdr/>
@@ -56874,9 +56137,9 @@
       </w:tcPr>
     </w:tblStylePr>
   </w:style>
-  <w:style w:type="table" w:styleId="1467">
+  <w:style w:type="table" w:styleId="1503">
     <w:name w:val="List Table 5 Dark - Accent 2"/>
-    <w:basedOn w:val="1380"/>
+    <w:basedOn w:val="1416"/>
     <w:uiPriority w:val="99"/>
     <w:pPr>
       <w:pBdr/>
@@ -57116,9 +56379,9 @@
       </w:tcPr>
     </w:tblStylePr>
   </w:style>
-  <w:style w:type="table" w:styleId="1468">
+  <w:style w:type="table" w:styleId="1504">
     <w:name w:val="List Table 5 Dark - Accent 3"/>
-    <w:basedOn w:val="1380"/>
+    <w:basedOn w:val="1416"/>
     <w:uiPriority w:val="99"/>
     <w:pPr>
       <w:pBdr/>
@@ -57358,9 +56621,9 @@
       </w:tcPr>
     </w:tblStylePr>
   </w:style>
-  <w:style w:type="table" w:styleId="1469">
+  <w:style w:type="table" w:styleId="1505">
     <w:name w:val="List Table 5 Dark - Accent 4"/>
-    <w:basedOn w:val="1380"/>
+    <w:basedOn w:val="1416"/>
     <w:uiPriority w:val="99"/>
     <w:pPr>
       <w:pBdr/>
@@ -57600,9 +56863,9 @@
       </w:tcPr>
     </w:tblStylePr>
   </w:style>
-  <w:style w:type="table" w:styleId="1470">
+  <w:style w:type="table" w:styleId="1506">
     <w:name w:val="List Table 5 Dark - Accent 5"/>
-    <w:basedOn w:val="1380"/>
+    <w:basedOn w:val="1416"/>
     <w:uiPriority w:val="99"/>
     <w:pPr>
       <w:pBdr/>
@@ -57842,9 +57105,9 @@
       </w:tcPr>
     </w:tblStylePr>
   </w:style>
-  <w:style w:type="table" w:styleId="1471">
+  <w:style w:type="table" w:styleId="1507">
     <w:name w:val="List Table 5 Dark - Accent 6"/>
-    <w:basedOn w:val="1380"/>
+    <w:basedOn w:val="1416"/>
     <w:uiPriority w:val="99"/>
     <w:pPr>
       <w:pBdr/>
@@ -58084,9 +57347,9 @@
       </w:tcPr>
     </w:tblStylePr>
   </w:style>
-  <w:style w:type="table" w:styleId="1472">
+  <w:style w:type="table" w:styleId="1508">
     <w:name w:val="List Table 6 Colorful"/>
-    <w:basedOn w:val="1380"/>
+    <w:basedOn w:val="1416"/>
     <w:uiPriority w:val="99"/>
     <w:pPr>
       <w:pBdr/>
@@ -58307,9 +57570,9 @@
       </w:tcPr>
     </w:tblStylePr>
   </w:style>
-  <w:style w:type="table" w:styleId="1473">
+  <w:style w:type="table" w:styleId="1509">
     <w:name w:val="List Table 6 Colorful - Accent 1"/>
-    <w:basedOn w:val="1380"/>
+    <w:basedOn w:val="1416"/>
     <w:uiPriority w:val="99"/>
     <w:pPr>
       <w:pBdr/>
@@ -58530,9 +57793,9 @@
       </w:tcPr>
     </w:tblStylePr>
   </w:style>
-  <w:style w:type="table" w:styleId="1474">
+  <w:style w:type="table" w:styleId="1510">
     <w:name w:val="List Table 6 Colorful - Accent 2"/>
-    <w:basedOn w:val="1380"/>
+    <w:basedOn w:val="1416"/>
     <w:uiPriority w:val="99"/>
     <w:pPr>
       <w:pBdr/>
@@ -58753,9 +58016,9 @@
       </w:tcPr>
     </w:tblStylePr>
   </w:style>
-  <w:style w:type="table" w:styleId="1475">
+  <w:style w:type="table" w:styleId="1511">
     <w:name w:val="List Table 6 Colorful - Accent 3"/>
-    <w:basedOn w:val="1380"/>
+    <w:basedOn w:val="1416"/>
     <w:uiPriority w:val="99"/>
     <w:pPr>
       <w:pBdr/>
@@ -58976,9 +58239,9 @@
       </w:tcPr>
     </w:tblStylePr>
   </w:style>
-  <w:style w:type="table" w:styleId="1476">
+  <w:style w:type="table" w:styleId="1512">
     <w:name w:val="List Table 6 Colorful - Accent 4"/>
-    <w:basedOn w:val="1380"/>
+    <w:basedOn w:val="1416"/>
     <w:uiPriority w:val="99"/>
     <w:pPr>
       <w:pBdr/>
@@ -59199,9 +58462,9 @@
       </w:tcPr>
     </w:tblStylePr>
   </w:style>
-  <w:style w:type="table" w:styleId="1477">
+  <w:style w:type="table" w:styleId="1513">
     <w:name w:val="List Table 6 Colorful - Accent 5"/>
-    <w:basedOn w:val="1380"/>
+    <w:basedOn w:val="1416"/>
     <w:uiPriority w:val="99"/>
     <w:pPr>
       <w:pBdr/>
@@ -59422,9 +58685,9 @@
       </w:tcPr>
     </w:tblStylePr>
   </w:style>
-  <w:style w:type="table" w:styleId="1478">
+  <w:style w:type="table" w:styleId="1514">
     <w:name w:val="List Table 6 Colorful - Accent 6"/>
-    <w:basedOn w:val="1380"/>
+    <w:basedOn w:val="1416"/>
     <w:uiPriority w:val="99"/>
     <w:pPr>
       <w:pBdr/>
@@ -59645,9 +58908,9 @@
       </w:tcPr>
     </w:tblStylePr>
   </w:style>
-  <w:style w:type="table" w:styleId="1479">
+  <w:style w:type="table" w:styleId="1515">
     <w:name w:val="List Table 7 Colorful"/>
-    <w:basedOn w:val="1380"/>
+    <w:basedOn w:val="1416"/>
     <w:uiPriority w:val="99"/>
     <w:pPr>
       <w:pBdr/>
@@ -59901,9 +59164,9 @@
       </w:tcPr>
     </w:tblStylePr>
   </w:style>
-  <w:style w:type="table" w:styleId="1480">
+  <w:style w:type="table" w:styleId="1516">
     <w:name w:val="List Table 7 Colorful - Accent 1"/>
-    <w:basedOn w:val="1380"/>
+    <w:basedOn w:val="1416"/>
     <w:uiPriority w:val="99"/>
     <w:pPr>
       <w:pBdr/>
@@ -60157,9 +59420,9 @@
       </w:tcPr>
     </w:tblStylePr>
   </w:style>
-  <w:style w:type="table" w:styleId="1481">
+  <w:style w:type="table" w:styleId="1517">
     <w:name w:val="List Table 7 Colorful - Accent 2"/>
-    <w:basedOn w:val="1380"/>
+    <w:basedOn w:val="1416"/>
     <w:uiPriority w:val="99"/>
     <w:pPr>
       <w:pBdr/>
@@ -60413,9 +59676,9 @@
       </w:tcPr>
     </w:tblStylePr>
   </w:style>
-  <w:style w:type="table" w:styleId="1482">
+  <w:style w:type="table" w:styleId="1518">
     <w:name w:val="List Table 7 Colorful - Accent 3"/>
-    <w:basedOn w:val="1380"/>
+    <w:basedOn w:val="1416"/>
     <w:uiPriority w:val="99"/>
     <w:pPr>
       <w:pBdr/>
@@ -60669,9 +59932,9 @@
       </w:tcPr>
     </w:tblStylePr>
   </w:style>
-  <w:style w:type="table" w:styleId="1483">
+  <w:style w:type="table" w:styleId="1519">
     <w:name w:val="List Table 7 Colorful - Accent 4"/>
-    <w:basedOn w:val="1380"/>
+    <w:basedOn w:val="1416"/>
     <w:uiPriority w:val="99"/>
     <w:pPr>
       <w:pBdr/>
@@ -60925,9 +60188,9 @@
       </w:tcPr>
     </w:tblStylePr>
   </w:style>
-  <w:style w:type="table" w:styleId="1484">
+  <w:style w:type="table" w:styleId="1520">
     <w:name w:val="List Table 7 Colorful - Accent 5"/>
-    <w:basedOn w:val="1380"/>
+    <w:basedOn w:val="1416"/>
     <w:uiPriority w:val="99"/>
     <w:pPr>
       <w:pBdr/>
@@ -61181,9 +60444,9 @@
       </w:tcPr>
     </w:tblStylePr>
   </w:style>
-  <w:style w:type="table" w:styleId="1485">
+  <w:style w:type="table" w:styleId="1521">
     <w:name w:val="List Table 7 Colorful - Accent 6"/>
-    <w:basedOn w:val="1380"/>
+    <w:basedOn w:val="1416"/>
     <w:uiPriority w:val="99"/>
     <w:pPr>
       <w:pBdr/>
@@ -61437,9 +60700,9 @@
       </w:tcPr>
     </w:tblStylePr>
   </w:style>
-  <w:style w:type="table" w:styleId="1486">
+  <w:style w:type="table" w:styleId="1522">
     <w:name w:val="Lined - Accent"/>
-    <w:basedOn w:val="1380"/>
+    <w:basedOn w:val="1416"/>
     <w:uiPriority w:val="99"/>
     <w:pPr>
       <w:pBdr/>
@@ -61674,9 +60937,9 @@
       </w:tcPr>
     </w:tblStylePr>
   </w:style>
-  <w:style w:type="table" w:styleId="1487">
+  <w:style w:type="table" w:styleId="1523">
     <w:name w:val="Lined - Accent 1"/>
-    <w:basedOn w:val="1380"/>
+    <w:basedOn w:val="1416"/>
     <w:uiPriority w:val="99"/>
     <w:pPr>
       <w:pBdr/>
@@ -61911,9 +61174,9 @@
       </w:tcPr>
     </w:tblStylePr>
   </w:style>
-  <w:style w:type="table" w:styleId="1488">
+  <w:style w:type="table" w:styleId="1524">
     <w:name w:val="Lined - Accent 2"/>
-    <w:basedOn w:val="1380"/>
+    <w:basedOn w:val="1416"/>
     <w:uiPriority w:val="99"/>
     <w:pPr>
       <w:pBdr/>
@@ -62148,9 +61411,9 @@
       </w:tcPr>
     </w:tblStylePr>
   </w:style>
-  <w:style w:type="table" w:styleId="1489">
+  <w:style w:type="table" w:styleId="1525">
     <w:name w:val="Lined - Accent 3"/>
-    <w:basedOn w:val="1380"/>
+    <w:basedOn w:val="1416"/>
     <w:uiPriority w:val="99"/>
     <w:pPr>
       <w:pBdr/>
@@ -62385,9 +61648,9 @@
       </w:tcPr>
     </w:tblStylePr>
   </w:style>
-  <w:style w:type="table" w:styleId="1490">
+  <w:style w:type="table" w:styleId="1526">
     <w:name w:val="Lined - Accent 4"/>
-    <w:basedOn w:val="1380"/>
+    <w:basedOn w:val="1416"/>
     <w:uiPriority w:val="99"/>
     <w:pPr>
       <w:pBdr/>
@@ -62622,9 +61885,9 @@
       </w:tcPr>
     </w:tblStylePr>
   </w:style>
-  <w:style w:type="table" w:styleId="1491">
+  <w:style w:type="table" w:styleId="1527">
     <w:name w:val="Lined - Accent 5"/>
-    <w:basedOn w:val="1380"/>
+    <w:basedOn w:val="1416"/>
     <w:uiPriority w:val="99"/>
     <w:pPr>
       <w:pBdr/>
@@ -62859,9 +62122,9 @@
       </w:tcPr>
     </w:tblStylePr>
   </w:style>
-  <w:style w:type="table" w:styleId="1492">
+  <w:style w:type="table" w:styleId="1528">
     <w:name w:val="Lined - Accent 6"/>
-    <w:basedOn w:val="1380"/>
+    <w:basedOn w:val="1416"/>
     <w:uiPriority w:val="99"/>
     <w:pPr>
       <w:pBdr/>
@@ -63096,9 +62359,9 @@
       </w:tcPr>
     </w:tblStylePr>
   </w:style>
-  <w:style w:type="table" w:styleId="1493">
+  <w:style w:type="table" w:styleId="1529">
     <w:name w:val="Bordered &amp; Lined - Accent"/>
-    <w:basedOn w:val="1380"/>
+    <w:basedOn w:val="1416"/>
     <w:uiPriority w:val="99"/>
     <w:pPr>
       <w:pBdr/>
@@ -63340,9 +62603,9 @@
       </w:tcPr>
     </w:tblStylePr>
   </w:style>
-  <w:style w:type="table" w:styleId="1494">
+  <w:style w:type="table" w:styleId="1530">
     <w:name w:val="Bordered &amp; Lined - Accent 1"/>
-    <w:basedOn w:val="1380"/>
+    <w:basedOn w:val="1416"/>
     <w:uiPriority w:val="99"/>
     <w:pPr>
       <w:pBdr/>
@@ -63584,9 +62847,9 @@
       </w:tcPr>
     </w:tblStylePr>
   </w:style>
-  <w:style w:type="table" w:styleId="1495">
+  <w:style w:type="table" w:styleId="1531">
     <w:name w:val="Bordered &amp; Lined - Accent 2"/>
-    <w:basedOn w:val="1380"/>
+    <w:basedOn w:val="1416"/>
     <w:uiPriority w:val="99"/>
     <w:pPr>
       <w:pBdr/>
@@ -63828,9 +63091,9 @@
       </w:tcPr>
     </w:tblStylePr>
   </w:style>
-  <w:style w:type="table" w:styleId="1496">
+  <w:style w:type="table" w:styleId="1532">
     <w:name w:val="Bordered &amp; Lined - Accent 3"/>
-    <w:basedOn w:val="1380"/>
+    <w:basedOn w:val="1416"/>
     <w:uiPriority w:val="99"/>
     <w:pPr>
       <w:pBdr/>
@@ -64072,9 +63335,9 @@
       </w:tcPr>
     </w:tblStylePr>
   </w:style>
-  <w:style w:type="table" w:styleId="1497">
+  <w:style w:type="table" w:styleId="1533">
     <w:name w:val="Bordered &amp; Lined - Accent 4"/>
-    <w:basedOn w:val="1380"/>
+    <w:basedOn w:val="1416"/>
     <w:uiPriority w:val="99"/>
     <w:pPr>
       <w:pBdr/>
@@ -64316,9 +63579,9 @@
       </w:tcPr>
     </w:tblStylePr>
   </w:style>
-  <w:style w:type="table" w:styleId="1498">
+  <w:style w:type="table" w:styleId="1534">
     <w:name w:val="Bordered &amp; Lined - Accent 5"/>
-    <w:basedOn w:val="1380"/>
+    <w:basedOn w:val="1416"/>
     <w:uiPriority w:val="99"/>
     <w:pPr>
       <w:pBdr/>
@@ -64560,9 +63823,9 @@
       </w:tcPr>
     </w:tblStylePr>
   </w:style>
-  <w:style w:type="table" w:styleId="1499">
+  <w:style w:type="table" w:styleId="1535">
     <w:name w:val="Bordered &amp; Lined - Accent 6"/>
-    <w:basedOn w:val="1380"/>
+    <w:basedOn w:val="1416"/>
     <w:uiPriority w:val="99"/>
     <w:pPr>
       <w:pBdr/>
@@ -64804,9 +64067,9 @@
       </w:tcPr>
     </w:tblStylePr>
   </w:style>
-  <w:style w:type="table" w:styleId="1500">
+  <w:style w:type="table" w:styleId="1536">
     <w:name w:val="Bordered"/>
-    <w:basedOn w:val="1380"/>
+    <w:basedOn w:val="1416"/>
     <w:uiPriority w:val="99"/>
     <w:pPr>
       <w:pBdr/>
@@ -65035,9 +64298,9 @@
       </w:tcPr>
     </w:tblStylePr>
   </w:style>
-  <w:style w:type="table" w:styleId="1501">
+  <w:style w:type="table" w:styleId="1537">
     <w:name w:val="Bordered - Accent 1"/>
-    <w:basedOn w:val="1380"/>
+    <w:basedOn w:val="1416"/>
     <w:uiPriority w:val="99"/>
     <w:pPr>
       <w:pBdr/>
@@ -65266,9 +64529,9 @@
       </w:tcPr>
     </w:tblStylePr>
   </w:style>
-  <w:style w:type="table" w:styleId="1502">
+  <w:style w:type="table" w:styleId="1538">
     <w:name w:val="Bordered - Accent 2"/>
-    <w:basedOn w:val="1380"/>
+    <w:basedOn w:val="1416"/>
     <w:uiPriority w:val="99"/>
     <w:pPr>
       <w:pBdr/>
@@ -65497,9 +64760,9 @@
       </w:tcPr>
     </w:tblStylePr>
   </w:style>
-  <w:style w:type="table" w:styleId="1503">
+  <w:style w:type="table" w:styleId="1539">
     <w:name w:val="Bordered - Accent 3"/>
-    <w:basedOn w:val="1380"/>
+    <w:basedOn w:val="1416"/>
     <w:uiPriority w:val="99"/>
     <w:pPr>
       <w:pBdr/>
@@ -65728,9 +64991,9 @@
       </w:tcPr>
     </w:tblStylePr>
   </w:style>
-  <w:style w:type="table" w:styleId="1504">
+  <w:style w:type="table" w:styleId="1540">
     <w:name w:val="Bordered - Accent 4"/>
-    <w:basedOn w:val="1380"/>
+    <w:basedOn w:val="1416"/>
     <w:uiPriority w:val="99"/>
     <w:pPr>
       <w:pBdr/>
@@ -65959,9 +65222,9 @@
       </w:tcPr>
     </w:tblStylePr>
   </w:style>
-  <w:style w:type="table" w:styleId="1505">
+  <w:style w:type="table" w:styleId="1541">
     <w:name w:val="Bordered - Accent 5"/>
-    <w:basedOn w:val="1380"/>
+    <w:basedOn w:val="1416"/>
     <w:uiPriority w:val="99"/>
     <w:pPr>
       <w:pBdr/>
@@ -66190,9 +65453,9 @@
       </w:tcPr>
     </w:tblStylePr>
   </w:style>
-  <w:style w:type="table" w:styleId="1506">
+  <w:style w:type="table" w:styleId="1542">
     <w:name w:val="Bordered - Accent 6"/>
-    <w:basedOn w:val="1380"/>
+    <w:basedOn w:val="1416"/>
     <w:uiPriority w:val="99"/>
     <w:pPr>
       <w:pBdr/>
@@ -66421,7 +65684,7 @@
       </w:tcPr>
     </w:tblStylePr>
   </w:style>
-  <w:style w:type="paragraph" w:styleId="1507" w:default="1">
+  <w:style w:type="paragraph" w:styleId="1543" w:default="1">
     <w:name w:val="Normal"/>
     <w:qFormat/>
     <w:pPr>
@@ -66430,11 +65693,11 @@
       <w:ind/>
     </w:pPr>
   </w:style>
-  <w:style w:type="paragraph" w:styleId="1508">
+  <w:style w:type="paragraph" w:styleId="1544">
     <w:name w:val="Heading 1"/>
-    <w:basedOn w:val="1507"/>
-    <w:next w:val="1507"/>
-    <w:link w:val="1519"/>
+    <w:basedOn w:val="1543"/>
+    <w:next w:val="1543"/>
+    <w:link w:val="1555"/>
     <w:uiPriority w:val="9"/>
     <w:qFormat/>
     <w:pPr>
@@ -66452,11 +65715,11 @@
       <w:szCs w:val="40"/>
     </w:rPr>
   </w:style>
-  <w:style w:type="paragraph" w:styleId="1509">
+  <w:style w:type="paragraph" w:styleId="1545">
     <w:name w:val="Heading 2"/>
-    <w:basedOn w:val="1507"/>
-    <w:next w:val="1507"/>
-    <w:link w:val="1520"/>
+    <w:basedOn w:val="1543"/>
+    <w:next w:val="1543"/>
+    <w:link w:val="1556"/>
     <w:uiPriority w:val="9"/>
     <w:unhideWhenUsed/>
     <w:qFormat/>
@@ -66475,11 +65738,11 @@
       <w:szCs w:val="32"/>
     </w:rPr>
   </w:style>
-  <w:style w:type="paragraph" w:styleId="1510">
+  <w:style w:type="paragraph" w:styleId="1546">
     <w:name w:val="Heading 3"/>
-    <w:basedOn w:val="1507"/>
-    <w:next w:val="1507"/>
-    <w:link w:val="1521"/>
+    <w:basedOn w:val="1543"/>
+    <w:next w:val="1543"/>
+    <w:link w:val="1557"/>
     <w:uiPriority w:val="9"/>
     <w:unhideWhenUsed/>
     <w:qFormat/>
@@ -66498,11 +65761,11 @@
       <w:szCs w:val="28"/>
     </w:rPr>
   </w:style>
-  <w:style w:type="paragraph" w:styleId="1511">
+  <w:style w:type="paragraph" w:styleId="1547">
     <w:name w:val="Heading 4"/>
-    <w:basedOn w:val="1507"/>
-    <w:next w:val="1507"/>
-    <w:link w:val="1522"/>
+    <w:basedOn w:val="1543"/>
+    <w:next w:val="1543"/>
+    <w:link w:val="1558"/>
     <w:uiPriority w:val="9"/>
     <w:unhideWhenUsed/>
     <w:qFormat/>
@@ -66521,11 +65784,11 @@
       <w:color w:val="0f4761" w:themeColor="accent1" w:themeShade="BF"/>
     </w:rPr>
   </w:style>
-  <w:style w:type="paragraph" w:styleId="1512">
+  <w:style w:type="paragraph" w:styleId="1548">
     <w:name w:val="Heading 5"/>
-    <w:basedOn w:val="1507"/>
-    <w:next w:val="1507"/>
-    <w:link w:val="1523"/>
+    <w:basedOn w:val="1543"/>
+    <w:next w:val="1543"/>
+    <w:link w:val="1559"/>
     <w:uiPriority w:val="9"/>
     <w:unhideWhenUsed/>
     <w:qFormat/>
@@ -66542,11 +65805,11 @@
       <w:color w:val="0f4761" w:themeColor="accent1" w:themeShade="BF"/>
     </w:rPr>
   </w:style>
-  <w:style w:type="paragraph" w:styleId="1513">
+  <w:style w:type="paragraph" w:styleId="1549">
     <w:name w:val="Heading 6"/>
-    <w:basedOn w:val="1507"/>
-    <w:next w:val="1507"/>
-    <w:link w:val="1524"/>
+    <w:basedOn w:val="1543"/>
+    <w:next w:val="1543"/>
+    <w:link w:val="1560"/>
     <w:uiPriority w:val="9"/>
     <w:unhideWhenUsed/>
     <w:qFormat/>
@@ -66565,11 +65828,11 @@
       <w:color w:val="595959" w:themeColor="text1" w:themeTint="A6"/>
     </w:rPr>
   </w:style>
-  <w:style w:type="paragraph" w:styleId="1514">
+  <w:style w:type="paragraph" w:styleId="1550">
     <w:name w:val="Heading 7"/>
-    <w:basedOn w:val="1507"/>
-    <w:next w:val="1507"/>
-    <w:link w:val="1525"/>
+    <w:basedOn w:val="1543"/>
+    <w:next w:val="1543"/>
+    <w:link w:val="1561"/>
     <w:uiPriority w:val="9"/>
     <w:unhideWhenUsed/>
     <w:qFormat/>
@@ -66586,11 +65849,11 @@
       <w:color w:val="595959" w:themeColor="text1" w:themeTint="A6"/>
     </w:rPr>
   </w:style>
-  <w:style w:type="paragraph" w:styleId="1515">
+  <w:style w:type="paragraph" w:styleId="1551">
     <w:name w:val="Heading 8"/>
-    <w:basedOn w:val="1507"/>
-    <w:next w:val="1507"/>
-    <w:link w:val="1526"/>
+    <w:basedOn w:val="1543"/>
+    <w:next w:val="1543"/>
+    <w:link w:val="1562"/>
     <w:uiPriority w:val="9"/>
     <w:unhideWhenUsed/>
     <w:qFormat/>
@@ -66609,11 +65872,11 @@
       <w:color w:val="272727" w:themeColor="text1" w:themeTint="D8"/>
     </w:rPr>
   </w:style>
-  <w:style w:type="paragraph" w:styleId="1516">
+  <w:style w:type="paragraph" w:styleId="1552">
     <w:name w:val="Heading 9"/>
-    <w:basedOn w:val="1507"/>
-    <w:next w:val="1507"/>
-    <w:link w:val="1527"/>
+    <w:basedOn w:val="1543"/>
+    <w:next w:val="1543"/>
+    <w:link w:val="1563"/>
     <w:uiPriority w:val="9"/>
     <w:unhideWhenUsed/>
     <w:qFormat/>
@@ -66632,7 +65895,7 @@
       <w:color w:val="272727" w:themeColor="text1" w:themeTint="D8"/>
     </w:rPr>
   </w:style>
-  <w:style w:type="character" w:styleId="1517" w:default="1">
+  <w:style w:type="character" w:styleId="1553" w:default="1">
     <w:name w:val="Default Paragraph Font"/>
     <w:uiPriority w:val="1"/>
     <w:semiHidden/>
@@ -66643,7 +65906,7 @@
       <w:ind/>
     </w:pPr>
   </w:style>
-  <w:style w:type="numbering" w:styleId="1518" w:default="1">
+  <w:style w:type="numbering" w:styleId="1554" w:default="1">
     <w:name w:val="No List"/>
     <w:uiPriority w:val="99"/>
     <w:semiHidden/>
@@ -66654,10 +65917,10 @@
       <w:ind/>
     </w:pPr>
   </w:style>
-  <w:style w:type="character" w:styleId="1519">
+  <w:style w:type="character" w:styleId="1555">
     <w:name w:val="Heading 1 Char"/>
-    <w:basedOn w:val="1517"/>
-    <w:link w:val="1508"/>
+    <w:basedOn w:val="1553"/>
+    <w:link w:val="1544"/>
     <w:uiPriority w:val="9"/>
     <w:pPr>
       <w:pBdr/>
@@ -66671,10 +65934,10 @@
       <w:szCs w:val="40"/>
     </w:rPr>
   </w:style>
-  <w:style w:type="character" w:styleId="1520">
+  <w:style w:type="character" w:styleId="1556">
     <w:name w:val="Heading 2 Char"/>
-    <w:basedOn w:val="1517"/>
-    <w:link w:val="1509"/>
+    <w:basedOn w:val="1553"/>
+    <w:link w:val="1545"/>
     <w:uiPriority w:val="9"/>
     <w:pPr>
       <w:pBdr/>
@@ -66688,10 +65951,10 @@
       <w:szCs w:val="32"/>
     </w:rPr>
   </w:style>
-  <w:style w:type="character" w:styleId="1521">
+  <w:style w:type="character" w:styleId="1557">
     <w:name w:val="Heading 3 Char"/>
-    <w:basedOn w:val="1517"/>
-    <w:link w:val="1510"/>
+    <w:basedOn w:val="1553"/>
+    <w:link w:val="1546"/>
     <w:uiPriority w:val="9"/>
     <w:pPr>
       <w:pBdr/>
@@ -66705,10 +65968,10 @@
       <w:szCs w:val="28"/>
     </w:rPr>
   </w:style>
-  <w:style w:type="character" w:styleId="1522">
+  <w:style w:type="character" w:styleId="1558">
     <w:name w:val="Heading 4 Char"/>
-    <w:basedOn w:val="1517"/>
-    <w:link w:val="1511"/>
+    <w:basedOn w:val="1553"/>
+    <w:link w:val="1547"/>
     <w:uiPriority w:val="9"/>
     <w:pPr>
       <w:pBdr/>
@@ -66722,10 +65985,10 @@
       <w:color w:val="0f4761" w:themeColor="accent1" w:themeShade="BF"/>
     </w:rPr>
   </w:style>
-  <w:style w:type="character" w:styleId="1523">
+  <w:style w:type="character" w:styleId="1559">
     <w:name w:val="Heading 5 Char"/>
-    <w:basedOn w:val="1517"/>
-    <w:link w:val="1512"/>
+    <w:basedOn w:val="1553"/>
+    <w:link w:val="1548"/>
     <w:uiPriority w:val="9"/>
     <w:pPr>
       <w:pBdr/>
@@ -66737,10 +66000,10 @@
       <w:color w:val="0f4761" w:themeColor="accent1" w:themeShade="BF"/>
     </w:rPr>
   </w:style>
-  <w:style w:type="character" w:styleId="1524">
+  <w:style w:type="character" w:styleId="1560">
     <w:name w:val="Heading 6 Char"/>
-    <w:basedOn w:val="1517"/>
-    <w:link w:val="1513"/>
+    <w:basedOn w:val="1553"/>
+    <w:link w:val="1549"/>
     <w:uiPriority w:val="9"/>
     <w:pPr>
       <w:pBdr/>
@@ -66754,10 +66017,10 @@
       <w:color w:val="595959" w:themeColor="text1" w:themeTint="A6"/>
     </w:rPr>
   </w:style>
-  <w:style w:type="character" w:styleId="1525">
+  <w:style w:type="character" w:styleId="1561">
     <w:name w:val="Heading 7 Char"/>
-    <w:basedOn w:val="1517"/>
-    <w:link w:val="1514"/>
+    <w:basedOn w:val="1553"/>
+    <w:link w:val="1550"/>
     <w:uiPriority w:val="9"/>
     <w:pPr>
       <w:pBdr/>
@@ -66769,10 +66032,10 @@
       <w:color w:val="595959" w:themeColor="text1" w:themeTint="A6"/>
     </w:rPr>
   </w:style>
-  <w:style w:type="character" w:styleId="1526">
+  <w:style w:type="character" w:styleId="1562">
     <w:name w:val="Heading 8 Char"/>
-    <w:basedOn w:val="1517"/>
-    <w:link w:val="1515"/>
+    <w:basedOn w:val="1553"/>
+    <w:link w:val="1551"/>
     <w:uiPriority w:val="9"/>
     <w:pPr>
       <w:pBdr/>
@@ -66786,10 +66049,10 @@
       <w:color w:val="272727" w:themeColor="text1" w:themeTint="D8"/>
     </w:rPr>
   </w:style>
-  <w:style w:type="character" w:styleId="1527">
+  <w:style w:type="character" w:styleId="1563">
     <w:name w:val="Heading 9 Char"/>
-    <w:basedOn w:val="1517"/>
-    <w:link w:val="1516"/>
+    <w:basedOn w:val="1553"/>
+    <w:link w:val="1552"/>
     <w:uiPriority w:val="9"/>
     <w:pPr>
       <w:pBdr/>
@@ -66803,11 +66066,11 @@
       <w:color w:val="272727" w:themeColor="text1" w:themeTint="D8"/>
     </w:rPr>
   </w:style>
-  <w:style w:type="paragraph" w:styleId="1528">
+  <w:style w:type="paragraph" w:styleId="1564">
     <w:name w:val="Title"/>
-    <w:basedOn w:val="1507"/>
-    <w:next w:val="1507"/>
-    <w:link w:val="1529"/>
+    <w:basedOn w:val="1543"/>
+    <w:next w:val="1543"/>
+    <w:link w:val="1565"/>
     <w:uiPriority w:val="10"/>
     <w:qFormat/>
     <w:pPr>
@@ -66823,10 +66086,10 @@
       <w:szCs w:val="56"/>
     </w:rPr>
   </w:style>
-  <w:style w:type="character" w:styleId="1529">
+  <w:style w:type="character" w:styleId="1565">
     <w:name w:val="Title Char"/>
-    <w:basedOn w:val="1517"/>
-    <w:link w:val="1528"/>
+    <w:basedOn w:val="1553"/>
+    <w:link w:val="1564"/>
     <w:uiPriority w:val="10"/>
     <w:pPr>
       <w:pBdr/>
@@ -66840,11 +66103,11 @@
       <w:szCs w:val="56"/>
     </w:rPr>
   </w:style>
-  <w:style w:type="paragraph" w:styleId="1530">
+  <w:style w:type="paragraph" w:styleId="1566">
     <w:name w:val="Subtitle"/>
-    <w:basedOn w:val="1507"/>
-    <w:next w:val="1507"/>
-    <w:link w:val="1531"/>
+    <w:basedOn w:val="1543"/>
+    <w:next w:val="1543"/>
+    <w:link w:val="1567"/>
     <w:uiPriority w:val="11"/>
     <w:qFormat/>
     <w:pPr>
@@ -66862,10 +66125,10 @@
       <w:szCs w:val="28"/>
     </w:rPr>
   </w:style>
-  <w:style w:type="character" w:styleId="1531">
+  <w:style w:type="character" w:styleId="1567">
     <w:name w:val="Subtitle Char"/>
-    <w:basedOn w:val="1517"/>
-    <w:link w:val="1530"/>
+    <w:basedOn w:val="1553"/>
+    <w:link w:val="1566"/>
     <w:uiPriority w:val="11"/>
     <w:pPr>
       <w:pBdr/>
@@ -66879,11 +66142,11 @@
       <w:szCs w:val="28"/>
     </w:rPr>
   </w:style>
-  <w:style w:type="paragraph" w:styleId="1532">
+  <w:style w:type="paragraph" w:styleId="1568">
     <w:name w:val="Quote"/>
-    <w:basedOn w:val="1507"/>
-    <w:next w:val="1507"/>
-    <w:link w:val="1533"/>
+    <w:basedOn w:val="1543"/>
+    <w:next w:val="1543"/>
+    <w:link w:val="1569"/>
     <w:uiPriority w:val="29"/>
     <w:qFormat/>
     <w:pPr>
@@ -66898,10 +66161,10 @@
       <w:color w:val="404040" w:themeColor="text1" w:themeTint="BF"/>
     </w:rPr>
   </w:style>
-  <w:style w:type="character" w:styleId="1533">
+  <w:style w:type="character" w:styleId="1569">
     <w:name w:val="Quote Char"/>
-    <w:basedOn w:val="1517"/>
-    <w:link w:val="1532"/>
+    <w:basedOn w:val="1553"/>
+    <w:link w:val="1568"/>
     <w:uiPriority w:val="29"/>
     <w:pPr>
       <w:pBdr/>
@@ -66914,9 +66177,9 @@
       <w:color w:val="404040" w:themeColor="text1" w:themeTint="BF"/>
     </w:rPr>
   </w:style>
-  <w:style w:type="paragraph" w:styleId="1534">
+  <w:style w:type="paragraph" w:styleId="1570">
     <w:name w:val="List Paragraph"/>
-    <w:basedOn w:val="1507"/>
+    <w:basedOn w:val="1543"/>
     <w:uiPriority w:val="34"/>
     <w:qFormat/>
     <w:pPr>
@@ -66926,9 +66189,9 @@
       <w:contextualSpacing w:val="true"/>
     </w:pPr>
   </w:style>
-  <w:style w:type="character" w:styleId="1535">
+  <w:style w:type="character" w:styleId="1571">
     <w:name w:val="Intense Emphasis"/>
-    <w:basedOn w:val="1517"/>
+    <w:basedOn w:val="1553"/>
     <w:uiPriority w:val="21"/>
     <w:qFormat/>
     <w:pPr>
@@ -66942,11 +66205,11 @@
       <w:color w:val="0f4761" w:themeColor="accent1" w:themeShade="BF"/>
     </w:rPr>
   </w:style>
-  <w:style w:type="paragraph" w:styleId="1536">
+  <w:style w:type="paragraph" w:styleId="1572">
     <w:name w:val="Intense Quote"/>
-    <w:basedOn w:val="1507"/>
-    <w:next w:val="1507"/>
-    <w:link w:val="1537"/>
+    <w:basedOn w:val="1543"/>
+    <w:next w:val="1543"/>
+    <w:link w:val="1573"/>
     <w:uiPriority w:val="30"/>
     <w:qFormat/>
     <w:pPr>
@@ -66964,10 +66227,10 @@
       <w:color w:val="0f4761" w:themeColor="accent1" w:themeShade="BF"/>
     </w:rPr>
   </w:style>
-  <w:style w:type="character" w:styleId="1537">
+  <w:style w:type="character" w:styleId="1573">
     <w:name w:val="Intense Quote Char"/>
-    <w:basedOn w:val="1517"/>
-    <w:link w:val="1536"/>
+    <w:basedOn w:val="1553"/>
+    <w:link w:val="1572"/>
     <w:uiPriority w:val="30"/>
     <w:pPr>
       <w:pBdr/>
@@ -66980,9 +66243,9 @@
       <w:color w:val="0f4761" w:themeColor="accent1" w:themeShade="BF"/>
     </w:rPr>
   </w:style>
-  <w:style w:type="character" w:styleId="1538">
+  <w:style w:type="character" w:styleId="1574">
     <w:name w:val="Intense Reference"/>
-    <w:basedOn w:val="1517"/>
+    <w:basedOn w:val="1553"/>
     <w:uiPriority w:val="32"/>
     <w:qFormat/>
     <w:pPr>
@@ -66998,9 +66261,9 @@
       <w:spacing w:val="5"/>
     </w:rPr>
   </w:style>
-  <w:style w:type="paragraph" w:styleId="1539">
+  <w:style w:type="paragraph" w:styleId="1575">
     <w:name w:val="No Spacing"/>
-    <w:basedOn w:val="1507"/>
+    <w:basedOn w:val="1543"/>
     <w:uiPriority w:val="1"/>
     <w:qFormat/>
     <w:pPr>
@@ -67009,9 +66272,9 @@
       <w:ind/>
     </w:pPr>
   </w:style>
-  <w:style w:type="character" w:styleId="1540">
+  <w:style w:type="character" w:styleId="1576">
     <w:name w:val="Subtle Emphasis"/>
-    <w:basedOn w:val="1517"/>
+    <w:basedOn w:val="1553"/>
     <w:uiPriority w:val="19"/>
     <w:qFormat/>
     <w:pPr>
@@ -67025,9 +66288,9 @@
       <w:color w:val="404040" w:themeColor="text1" w:themeTint="BF"/>
     </w:rPr>
   </w:style>
-  <w:style w:type="character" w:styleId="1541">
+  <w:style w:type="character" w:styleId="1577">
     <w:name w:val="Emphasis"/>
-    <w:basedOn w:val="1517"/>
+    <w:basedOn w:val="1553"/>
     <w:uiPriority w:val="20"/>
     <w:qFormat/>
     <w:pPr>
@@ -67040,9 +66303,9 @@
       <w:iCs/>
     </w:rPr>
   </w:style>
-  <w:style w:type="character" w:styleId="1542">
+  <w:style w:type="character" w:styleId="1578">
     <w:name w:val="Strong"/>
-    <w:basedOn w:val="1517"/>
+    <w:basedOn w:val="1553"/>
     <w:uiPriority w:val="22"/>
     <w:qFormat/>
     <w:pPr>
@@ -67055,9 +66318,9 @@
       <w:bCs/>
     </w:rPr>
   </w:style>
-  <w:style w:type="character" w:styleId="1543">
+  <w:style w:type="character" w:styleId="1579">
     <w:name w:val="Subtle Reference"/>
-    <w:basedOn w:val="1517"/>
+    <w:basedOn w:val="1553"/>
     <w:uiPriority w:val="31"/>
     <w:qFormat/>
     <w:pPr>
@@ -67070,9 +66333,9 @@
       <w:color w:val="5a5a5a" w:themeColor="text1" w:themeTint="A5"/>
     </w:rPr>
   </w:style>
-  <w:style w:type="character" w:styleId="1544">
+  <w:style w:type="character" w:styleId="1580">
     <w:name w:val="Book Title"/>
-    <w:basedOn w:val="1517"/>
+    <w:basedOn w:val="1553"/>
     <w:uiPriority w:val="33"/>
     <w:qFormat/>
     <w:pPr>
@@ -67088,10 +66351,10 @@
       <w:spacing w:val="5"/>
     </w:rPr>
   </w:style>
-  <w:style w:type="paragraph" w:styleId="1545">
+  <w:style w:type="paragraph" w:styleId="1581">
     <w:name w:val="Header"/>
-    <w:basedOn w:val="1507"/>
-    <w:link w:val="1546"/>
+    <w:basedOn w:val="1543"/>
+    <w:link w:val="1582"/>
     <w:uiPriority w:val="99"/>
     <w:unhideWhenUsed/>
     <w:pPr>
@@ -67104,10 +66367,10 @@
       <w:ind/>
     </w:pPr>
   </w:style>
-  <w:style w:type="character" w:styleId="1546">
+  <w:style w:type="character" w:styleId="1582">
     <w:name w:val="Header Char"/>
-    <w:basedOn w:val="1517"/>
-    <w:link w:val="1545"/>
+    <w:basedOn w:val="1553"/>
+    <w:link w:val="1581"/>
     <w:uiPriority w:val="99"/>
     <w:pPr>
       <w:pBdr/>
@@ -67115,10 +66378,10 @@
       <w:ind/>
     </w:pPr>
   </w:style>
-  <w:style w:type="paragraph" w:styleId="1547">
+  <w:style w:type="paragraph" w:styleId="1583">
     <w:name w:val="Footer"/>
-    <w:basedOn w:val="1507"/>
-    <w:link w:val="1548"/>
+    <w:basedOn w:val="1543"/>
+    <w:link w:val="1584"/>
     <w:uiPriority w:val="99"/>
     <w:unhideWhenUsed/>
     <w:pPr>
@@ -67131,10 +66394,10 @@
       <w:ind/>
     </w:pPr>
   </w:style>
-  <w:style w:type="character" w:styleId="1548">
+  <w:style w:type="character" w:styleId="1584">
     <w:name w:val="Footer Char"/>
-    <w:basedOn w:val="1517"/>
-    <w:link w:val="1547"/>
+    <w:basedOn w:val="1553"/>
+    <w:link w:val="1583"/>
     <w:uiPriority w:val="99"/>
     <w:pPr>
       <w:pBdr/>
@@ -67142,10 +66405,10 @@
       <w:ind/>
     </w:pPr>
   </w:style>
-  <w:style w:type="paragraph" w:styleId="1549">
+  <w:style w:type="paragraph" w:styleId="1585">
     <w:name w:val="Caption"/>
-    <w:basedOn w:val="1507"/>
-    <w:next w:val="1507"/>
+    <w:basedOn w:val="1543"/>
+    <w:next w:val="1543"/>
     <w:uiPriority w:val="35"/>
     <w:unhideWhenUsed/>
     <w:qFormat/>
@@ -67162,10 +66425,10 @@
       <w:szCs w:val="18"/>
     </w:rPr>
   </w:style>
-  <w:style w:type="paragraph" w:styleId="1550">
+  <w:style w:type="paragraph" w:styleId="1586">
     <w:name w:val="footnote text"/>
-    <w:basedOn w:val="1507"/>
-    <w:link w:val="1551"/>
+    <w:basedOn w:val="1543"/>
+    <w:link w:val="1587"/>
     <w:uiPriority w:val="99"/>
     <w:semiHidden/>
     <w:unhideWhenUsed/>
@@ -67179,10 +66442,10 @@
       <w:szCs w:val="20"/>
     </w:rPr>
   </w:style>
-  <w:style w:type="character" w:styleId="1551">
+  <w:style w:type="character" w:styleId="1587">
     <w:name w:val="Footnote Text Char"/>
-    <w:basedOn w:val="1517"/>
-    <w:link w:val="1550"/>
+    <w:basedOn w:val="1553"/>
+    <w:link w:val="1586"/>
     <w:uiPriority w:val="99"/>
     <w:semiHidden/>
     <w:pPr>
@@ -67195,9 +66458,9 @@
       <w:szCs w:val="20"/>
     </w:rPr>
   </w:style>
-  <w:style w:type="character" w:styleId="1552">
+  <w:style w:type="character" w:styleId="1588">
     <w:name w:val="footnote reference"/>
-    <w:basedOn w:val="1517"/>
+    <w:basedOn w:val="1553"/>
     <w:uiPriority w:val="99"/>
     <w:semiHidden/>
     <w:unhideWhenUsed/>
@@ -67210,10 +66473,10 @@
       <w:vertAlign w:val="superscript"/>
     </w:rPr>
   </w:style>
-  <w:style w:type="paragraph" w:styleId="1553">
+  <w:style w:type="paragraph" w:styleId="1589">
     <w:name w:val="endnote text"/>
-    <w:basedOn w:val="1507"/>
-    <w:link w:val="1554"/>
+    <w:basedOn w:val="1543"/>
+    <w:link w:val="1590"/>
     <w:uiPriority w:val="99"/>
     <w:semiHidden/>
     <w:unhideWhenUsed/>
@@ -67227,10 +66490,10 @@
       <w:szCs w:val="20"/>
     </w:rPr>
   </w:style>
-  <w:style w:type="character" w:styleId="1554">
+  <w:style w:type="character" w:styleId="1590">
     <w:name w:val="Endnote Text Char"/>
-    <w:basedOn w:val="1517"/>
-    <w:link w:val="1553"/>
+    <w:basedOn w:val="1553"/>
+    <w:link w:val="1589"/>
     <w:uiPriority w:val="99"/>
     <w:semiHidden/>
     <w:pPr>
@@ -67243,9 +66506,9 @@
       <w:szCs w:val="20"/>
     </w:rPr>
   </w:style>
-  <w:style w:type="character" w:styleId="1555">
+  <w:style w:type="character" w:styleId="1591">
     <w:name w:val="endnote reference"/>
-    <w:basedOn w:val="1517"/>
+    <w:basedOn w:val="1553"/>
     <w:uiPriority w:val="99"/>
     <w:semiHidden/>
     <w:unhideWhenUsed/>
@@ -67258,9 +66521,9 @@
       <w:vertAlign w:val="superscript"/>
     </w:rPr>
   </w:style>
-  <w:style w:type="character" w:styleId="1556">
+  <w:style w:type="character" w:styleId="1592">
     <w:name w:val="Hyperlink"/>
-    <w:basedOn w:val="1517"/>
+    <w:basedOn w:val="1553"/>
     <w:uiPriority w:val="99"/>
     <w:unhideWhenUsed/>
     <w:pPr>
@@ -67273,9 +66536,9 @@
       <w:u w:val="single"/>
     </w:rPr>
   </w:style>
-  <w:style w:type="character" w:styleId="1557">
+  <w:style w:type="character" w:styleId="1593">
     <w:name w:val="FollowedHyperlink"/>
-    <w:basedOn w:val="1517"/>
+    <w:basedOn w:val="1553"/>
     <w:uiPriority w:val="99"/>
     <w:semiHidden/>
     <w:unhideWhenUsed/>
@@ -67289,10 +66552,10 @@
       <w:u w:val="single"/>
     </w:rPr>
   </w:style>
-  <w:style w:type="paragraph" w:styleId="1558">
+  <w:style w:type="paragraph" w:styleId="1594">
     <w:name w:val="toc 1"/>
-    <w:basedOn w:val="1507"/>
-    <w:next w:val="1507"/>
+    <w:basedOn w:val="1543"/>
+    <w:next w:val="1543"/>
     <w:uiPriority w:val="39"/>
     <w:unhideWhenUsed/>
     <w:pPr>
@@ -67301,10 +66564,10 @@
       <w:ind/>
     </w:pPr>
   </w:style>
-  <w:style w:type="paragraph" w:styleId="1559">
+  <w:style w:type="paragraph" w:styleId="1595">
     <w:name w:val="toc 2"/>
-    <w:basedOn w:val="1507"/>
-    <w:next w:val="1507"/>
+    <w:basedOn w:val="1543"/>
+    <w:next w:val="1543"/>
     <w:uiPriority w:val="39"/>
     <w:unhideWhenUsed/>
     <w:pPr>
@@ -67313,10 +66576,10 @@
       <w:ind w:left="220"/>
     </w:pPr>
   </w:style>
-  <w:style w:type="paragraph" w:styleId="1560">
+  <w:style w:type="paragraph" w:styleId="1596">
     <w:name w:val="toc 3"/>
-    <w:basedOn w:val="1507"/>
-    <w:next w:val="1507"/>
+    <w:basedOn w:val="1543"/>
+    <w:next w:val="1543"/>
     <w:uiPriority w:val="39"/>
     <w:unhideWhenUsed/>
     <w:pPr>
@@ -67325,10 +66588,10 @@
       <w:ind w:left="440"/>
     </w:pPr>
   </w:style>
-  <w:style w:type="paragraph" w:styleId="1561">
+  <w:style w:type="paragraph" w:styleId="1597">
     <w:name w:val="toc 4"/>
-    <w:basedOn w:val="1507"/>
-    <w:next w:val="1507"/>
+    <w:basedOn w:val="1543"/>
+    <w:next w:val="1543"/>
     <w:uiPriority w:val="39"/>
     <w:unhideWhenUsed/>
     <w:pPr>
@@ -67337,10 +66600,10 @@
       <w:ind w:left="660"/>
     </w:pPr>
   </w:style>
-  <w:style w:type="paragraph" w:styleId="1562">
+  <w:style w:type="paragraph" w:styleId="1598">
     <w:name w:val="toc 5"/>
-    <w:basedOn w:val="1507"/>
-    <w:next w:val="1507"/>
+    <w:basedOn w:val="1543"/>
+    <w:next w:val="1543"/>
     <w:uiPriority w:val="39"/>
     <w:unhideWhenUsed/>
     <w:pPr>
@@ -67349,10 +66612,10 @@
       <w:ind w:left="880"/>
     </w:pPr>
   </w:style>
-  <w:style w:type="paragraph" w:styleId="1563">
+  <w:style w:type="paragraph" w:styleId="1599">
     <w:name w:val="toc 6"/>
-    <w:basedOn w:val="1507"/>
-    <w:next w:val="1507"/>
+    <w:basedOn w:val="1543"/>
+    <w:next w:val="1543"/>
     <w:uiPriority w:val="39"/>
     <w:unhideWhenUsed/>
     <w:pPr>
@@ -67361,10 +66624,10 @@
       <w:ind w:left="1100"/>
     </w:pPr>
   </w:style>
-  <w:style w:type="paragraph" w:styleId="1564">
+  <w:style w:type="paragraph" w:styleId="1600">
     <w:name w:val="toc 7"/>
-    <w:basedOn w:val="1507"/>
-    <w:next w:val="1507"/>
+    <w:basedOn w:val="1543"/>
+    <w:next w:val="1543"/>
     <w:uiPriority w:val="39"/>
     <w:unhideWhenUsed/>
     <w:pPr>
@@ -67373,10 +66636,10 @@
       <w:ind w:left="1320"/>
     </w:pPr>
   </w:style>
-  <w:style w:type="paragraph" w:styleId="1565">
+  <w:style w:type="paragraph" w:styleId="1601">
     <w:name w:val="toc 8"/>
-    <w:basedOn w:val="1507"/>
-    <w:next w:val="1507"/>
+    <w:basedOn w:val="1543"/>
+    <w:next w:val="1543"/>
     <w:uiPriority w:val="39"/>
     <w:unhideWhenUsed/>
     <w:pPr>
@@ -67385,10 +66648,10 @@
       <w:ind w:left="1540"/>
     </w:pPr>
   </w:style>
-  <w:style w:type="paragraph" w:styleId="1566">
+  <w:style w:type="paragraph" w:styleId="1602">
     <w:name w:val="toc 9"/>
-    <w:basedOn w:val="1507"/>
-    <w:next w:val="1507"/>
+    <w:basedOn w:val="1543"/>
+    <w:next w:val="1543"/>
     <w:uiPriority w:val="39"/>
     <w:unhideWhenUsed/>
     <w:pPr>
@@ -67397,9 +66660,9 @@
       <w:ind w:left="1760"/>
     </w:pPr>
   </w:style>
-  <w:style w:type="character" w:styleId="1567">
+  <w:style w:type="character" w:styleId="1603">
     <w:name w:val="Placeholder Text"/>
-    <w:basedOn w:val="1517"/>
+    <w:basedOn w:val="1553"/>
     <w:uiPriority w:val="99"/>
     <w:semiHidden/>
     <w:pPr>
@@ -67411,7 +66674,7 @@
       <w:color w:val="666666"/>
     </w:rPr>
   </w:style>
-  <w:style w:type="paragraph" w:styleId="1568">
+  <w:style w:type="paragraph" w:styleId="1604">
     <w:name w:val="TOC Heading"/>
     <w:uiPriority w:val="39"/>
     <w:unhideWhenUsed/>
@@ -67421,10 +66684,10 @@
       <w:ind/>
     </w:pPr>
   </w:style>
-  <w:style w:type="paragraph" w:styleId="1569">
+  <w:style w:type="paragraph" w:styleId="1605">
     <w:name w:val="table of figures"/>
-    <w:basedOn w:val="1507"/>
-    <w:next w:val="1507"/>
+    <w:basedOn w:val="1543"/>
+    <w:next w:val="1543"/>
     <w:uiPriority w:val="99"/>
     <w:unhideWhenUsed/>
     <w:pPr>

</xml_diff>